<commit_message>
Notebook 03: SHAP, cross-model agreement, subgroup faithfulness + figures
</commit_message>
<xml_diff>
--- a/results/EWS_Progress_Report.docx
+++ b/results/EWS_Progress_Report.docx
@@ -12,7 +12,7 @@
     </w:p>
     <w:p>
       <w:r>
-        <w:t>Progress report built from saved results. Md Anas Biswas, University of Portsmouth.</w:t>
+        <w:t>Progress report built from saved results. Md Anas Biswas, University of Portsmouth. 2026-06-05.</w:t>
       </w:r>
     </w:p>
     <w:p>
@@ -20,7 +20,110 @@
         <w:pStyle w:val="Heading1"/>
       </w:pPr>
       <w:r>
-        <w:t>Model performance (NB02)</w:t>
+        <w:t>1. Dataset and feature engineering (NB01)</w:t>
+      </w:r>
+    </w:p>
+    <w:p>
+      <w:r>
+        <w:t>OULAD: 32,593 student-module enrolments. Overall at-risk rate 0.528. The at-risk rate rises with deprivation, from 0.425 in the least deprived band (90-100%) to 0.648 in the most deprived (0-10%); disabled students are flagged at 0.619 against 0.518 for their peers. Students with deprivation not recorded sit separately at 0.343.</w:t>
+      </w:r>
+    </w:p>
+    <w:p>
+      <w:r>
+        <w:drawing>
+          <wp:inline xmlns:a="http://schemas.openxmlformats.org/drawingml/2006/main" xmlns:pic="http://schemas.openxmlformats.org/drawingml/2006/picture">
+            <wp:extent cx="4846320" cy="2692400"/>
+            <wp:docPr id="1" name="Picture 1"/>
+            <wp:cNvGraphicFramePr>
+              <a:graphicFrameLocks noChangeAspect="1"/>
+            </wp:cNvGraphicFramePr>
+            <a:graphic>
+              <a:graphicData uri="http://schemas.openxmlformats.org/drawingml/2006/picture">
+                <pic:pic>
+                  <pic:nvPicPr>
+                    <pic:cNvPr id="0" name="fig_atrisk_by_imd.png"/>
+                    <pic:cNvPicPr/>
+                  </pic:nvPicPr>
+                  <pic:blipFill>
+                    <a:blip r:embed="rId9"/>
+                    <a:stretch>
+                      <a:fillRect/>
+                    </a:stretch>
+                  </pic:blipFill>
+                  <pic:spPr>
+                    <a:xfrm>
+                      <a:off x="0" y="0"/>
+                      <a:ext cx="4846320" cy="2692400"/>
+                    </a:xfrm>
+                    <a:prstGeom prst="rect"/>
+                  </pic:spPr>
+                </pic:pic>
+              </a:graphicData>
+            </a:graphic>
+          </wp:inline>
+        </w:drawing>
+      </w:r>
+    </w:p>
+    <w:p>
+      <w:r>
+        <w:rPr>
+          <w:i/>
+          <w:sz w:val="18"/>
+        </w:rPr>
+        <w:t>At-risk rate by deprivation band (IMD).</w:t>
+      </w:r>
+    </w:p>
+    <w:p>
+      <w:r>
+        <w:drawing>
+          <wp:inline xmlns:a="http://schemas.openxmlformats.org/drawingml/2006/main" xmlns:pic="http://schemas.openxmlformats.org/drawingml/2006/picture">
+            <wp:extent cx="4846320" cy="4615543"/>
+            <wp:docPr id="2" name="Picture 2"/>
+            <wp:cNvGraphicFramePr>
+              <a:graphicFrameLocks noChangeAspect="1"/>
+            </wp:cNvGraphicFramePr>
+            <a:graphic>
+              <a:graphicData uri="http://schemas.openxmlformats.org/drawingml/2006/picture">
+                <pic:pic>
+                  <pic:nvPicPr>
+                    <pic:cNvPr id="0" name="fig_atrisk_by_disability.png"/>
+                    <pic:cNvPicPr/>
+                  </pic:nvPicPr>
+                  <pic:blipFill>
+                    <a:blip r:embed="rId10"/>
+                    <a:stretch>
+                      <a:fillRect/>
+                    </a:stretch>
+                  </pic:blipFill>
+                  <pic:spPr>
+                    <a:xfrm>
+                      <a:off x="0" y="0"/>
+                      <a:ext cx="4846320" cy="4615543"/>
+                    </a:xfrm>
+                    <a:prstGeom prst="rect"/>
+                  </pic:spPr>
+                </pic:pic>
+              </a:graphicData>
+            </a:graphic>
+          </wp:inline>
+        </w:drawing>
+      </w:r>
+    </w:p>
+    <w:p>
+      <w:r>
+        <w:rPr>
+          <w:i/>
+          <w:sz w:val="18"/>
+        </w:rPr>
+        <w:t>At-risk rate by declared disability.</w:t>
+      </w:r>
+    </w:p>
+    <w:p>
+      <w:pPr>
+        <w:pStyle w:val="Heading1"/>
+      </w:pPr>
+      <w:r>
+        <w:t>2. Models and calibration (NB02)</w:t>
       </w:r>
     </w:p>
     <w:tbl>
@@ -1107,108 +1210,10 @@
       </w:tr>
     </w:tbl>
     <w:p>
-      <w:pPr>
-        <w:pStyle w:val="Heading1"/>
-      </w:pPr>
-      <w:r>
-        <w:t>Figures</w:t>
-      </w:r>
-    </w:p>
-    <w:p>
       <w:r>
         <w:drawing>
           <wp:inline xmlns:a="http://schemas.openxmlformats.org/drawingml/2006/main" xmlns:pic="http://schemas.openxmlformats.org/drawingml/2006/picture">
-            <wp:extent cx="5029200" cy="4789714"/>
-            <wp:docPr id="1" name="Picture 1"/>
-            <wp:cNvGraphicFramePr>
-              <a:graphicFrameLocks noChangeAspect="1"/>
-            </wp:cNvGraphicFramePr>
-            <a:graphic>
-              <a:graphicData uri="http://schemas.openxmlformats.org/drawingml/2006/picture">
-                <pic:pic>
-                  <pic:nvPicPr>
-                    <pic:cNvPr id="0" name="fig_atrisk_by_disability.png"/>
-                    <pic:cNvPicPr/>
-                  </pic:nvPicPr>
-                  <pic:blipFill>
-                    <a:blip r:embed="rId9"/>
-                    <a:stretch>
-                      <a:fillRect/>
-                    </a:stretch>
-                  </pic:blipFill>
-                  <pic:spPr>
-                    <a:xfrm>
-                      <a:off x="0" y="0"/>
-                      <a:ext cx="5029200" cy="4789714"/>
-                    </a:xfrm>
-                    <a:prstGeom prst="rect"/>
-                  </pic:spPr>
-                </pic:pic>
-              </a:graphicData>
-            </a:graphic>
-          </wp:inline>
-        </w:drawing>
-      </w:r>
-    </w:p>
-    <w:p>
-      <w:r>
-        <w:rPr>
-          <w:i/>
-          <w:sz w:val="18"/>
-        </w:rPr>
-        <w:t>fig_atrisk_by_disability.png</w:t>
-      </w:r>
-    </w:p>
-    <w:p>
-      <w:r>
-        <w:drawing>
-          <wp:inline xmlns:a="http://schemas.openxmlformats.org/drawingml/2006/main" xmlns:pic="http://schemas.openxmlformats.org/drawingml/2006/picture">
-            <wp:extent cx="5029200" cy="2794000"/>
-            <wp:docPr id="2" name="Picture 2"/>
-            <wp:cNvGraphicFramePr>
-              <a:graphicFrameLocks noChangeAspect="1"/>
-            </wp:cNvGraphicFramePr>
-            <a:graphic>
-              <a:graphicData uri="http://schemas.openxmlformats.org/drawingml/2006/picture">
-                <pic:pic>
-                  <pic:nvPicPr>
-                    <pic:cNvPr id="0" name="fig_atrisk_by_imd.png"/>
-                    <pic:cNvPicPr/>
-                  </pic:nvPicPr>
-                  <pic:blipFill>
-                    <a:blip r:embed="rId10"/>
-                    <a:stretch>
-                      <a:fillRect/>
-                    </a:stretch>
-                  </pic:blipFill>
-                  <pic:spPr>
-                    <a:xfrm>
-                      <a:off x="0" y="0"/>
-                      <a:ext cx="5029200" cy="2794000"/>
-                    </a:xfrm>
-                    <a:prstGeom prst="rect"/>
-                  </pic:spPr>
-                </pic:pic>
-              </a:graphicData>
-            </a:graphic>
-          </wp:inline>
-        </w:drawing>
-      </w:r>
-    </w:p>
-    <w:p>
-      <w:r>
-        <w:rPr>
-          <w:i/>
-          <w:sz w:val="18"/>
-        </w:rPr>
-        <w:t>fig_atrisk_by_imd.png</w:t>
-      </w:r>
-    </w:p>
-    <w:p>
-      <w:r>
-        <w:drawing>
-          <wp:inline xmlns:a="http://schemas.openxmlformats.org/drawingml/2006/main" xmlns:pic="http://schemas.openxmlformats.org/drawingml/2006/picture">
-            <wp:extent cx="5029200" cy="3352800"/>
+            <wp:extent cx="4846320" cy="3230880"/>
             <wp:docPr id="3" name="Picture 3"/>
             <wp:cNvGraphicFramePr>
               <a:graphicFrameLocks noChangeAspect="1"/>
@@ -1229,7 +1234,7 @@
                   <pic:spPr>
                     <a:xfrm>
                       <a:off x="0" y="0"/>
-                      <a:ext cx="5029200" cy="3352800"/>
+                      <a:ext cx="4846320" cy="3230880"/>
                     </a:xfrm>
                     <a:prstGeom prst="rect"/>
                   </pic:spPr>
@@ -1246,14 +1251,14 @@
           <w:i/>
           <w:sz w:val="18"/>
         </w:rPr>
-        <w:t>fig_auroc_by_cutoff.png</w:t>
+        <w:t>Test AUROC by week cutoff, three model families.</w:t>
       </w:r>
     </w:p>
     <w:p>
       <w:r>
         <w:drawing>
           <wp:inline xmlns:a="http://schemas.openxmlformats.org/drawingml/2006/main" xmlns:pic="http://schemas.openxmlformats.org/drawingml/2006/picture">
-            <wp:extent cx="5029200" cy="3352800"/>
+            <wp:extent cx="4846320" cy="3230880"/>
             <wp:docPr id="4" name="Picture 4"/>
             <wp:cNvGraphicFramePr>
               <a:graphicFrameLocks noChangeAspect="1"/>
@@ -1274,7 +1279,7 @@
                   <pic:spPr>
                     <a:xfrm>
                       <a:off x="0" y="0"/>
-                      <a:ext cx="5029200" cy="3352800"/>
+                      <a:ext cx="4846320" cy="3230880"/>
                     </a:xfrm>
                     <a:prstGeom prst="rect"/>
                   </pic:spPr>
@@ -1291,14 +1296,14 @@
           <w:i/>
           <w:sz w:val="18"/>
         </w:rPr>
-        <w:t>fig_ece_rf.png</w:t>
+        <w:t>Calibration error before and after isotonic, random forest.</w:t>
       </w:r>
     </w:p>
     <w:p>
       <w:r>
         <w:drawing>
           <wp:inline xmlns:a="http://schemas.openxmlformats.org/drawingml/2006/main" xmlns:pic="http://schemas.openxmlformats.org/drawingml/2006/picture">
-            <wp:extent cx="5029200" cy="5015515"/>
+            <wp:extent cx="4846320" cy="4833133"/>
             <wp:docPr id="5" name="Picture 5"/>
             <wp:cNvGraphicFramePr>
               <a:graphicFrameLocks noChangeAspect="1"/>
@@ -1319,7 +1324,7 @@
                   <pic:spPr>
                     <a:xfrm>
                       <a:off x="0" y="0"/>
-                      <a:ext cx="5029200" cy="5015515"/>
+                      <a:ext cx="4846320" cy="4833133"/>
                     </a:xfrm>
                     <a:prstGeom prst="rect"/>
                   </pic:spPr>
@@ -1336,7 +1341,1951 @@
           <w:i/>
           <w:sz w:val="18"/>
         </w:rPr>
-        <w:t>fig_reliability_week15_hgb.png</w:t>
+        <w:t>Reliability curve, week 15 gradient boosting.</w:t>
+      </w:r>
+    </w:p>
+    <w:p>
+      <w:pPr>
+        <w:pStyle w:val="Heading1"/>
+      </w:pPr>
+      <w:r>
+        <w:t>3. SHAP agreement and faithfulness (NB03)</w:t>
+      </w:r>
+    </w:p>
+    <w:p>
+      <w:r>
+        <w:t>Cross-model SHAP agreement (Spearman/Kendall rank correlation, 95% CI):</w:t>
+      </w:r>
+    </w:p>
+    <w:tbl>
+      <w:tblPr>
+        <w:tblStyle w:val="LightGrid-Accent1"/>
+        <w:tblW w:type="auto" w:w="0"/>
+        <w:tblLook w:firstColumn="1" w:firstRow="1" w:lastColumn="0" w:lastRow="0" w:noHBand="0" w:noVBand="1" w:val="04A0"/>
+      </w:tblPr>
+      <w:tblGrid>
+        <w:gridCol w:w="1440"/>
+        <w:gridCol w:w="1440"/>
+        <w:gridCol w:w="1440"/>
+        <w:gridCol w:w="1440"/>
+        <w:gridCol w:w="1440"/>
+        <w:gridCol w:w="1440"/>
+      </w:tblGrid>
+      <w:tr>
+        <w:tc>
+          <w:tcPr>
+            <w:tcW w:type="dxa" w:w="1440"/>
+          </w:tcPr>
+          <w:p>
+            <w:r>
+              <w:t>cutoff_week</w:t>
+            </w:r>
+          </w:p>
+        </w:tc>
+        <w:tc>
+          <w:tcPr>
+            <w:tcW w:type="dxa" w:w="1440"/>
+          </w:tcPr>
+          <w:p>
+            <w:r>
+              <w:t>pair</w:t>
+            </w:r>
+          </w:p>
+        </w:tc>
+        <w:tc>
+          <w:tcPr>
+            <w:tcW w:type="dxa" w:w="1440"/>
+          </w:tcPr>
+          <w:p>
+            <w:r>
+              <w:t>spearman</w:t>
+            </w:r>
+          </w:p>
+        </w:tc>
+        <w:tc>
+          <w:tcPr>
+            <w:tcW w:type="dxa" w:w="1440"/>
+          </w:tcPr>
+          <w:p>
+            <w:r>
+              <w:t>spearman_lo</w:t>
+            </w:r>
+          </w:p>
+        </w:tc>
+        <w:tc>
+          <w:tcPr>
+            <w:tcW w:type="dxa" w:w="1440"/>
+          </w:tcPr>
+          <w:p>
+            <w:r>
+              <w:t>spearman_hi</w:t>
+            </w:r>
+          </w:p>
+        </w:tc>
+        <w:tc>
+          <w:tcPr>
+            <w:tcW w:type="dxa" w:w="1440"/>
+          </w:tcPr>
+          <w:p>
+            <w:r>
+              <w:t>kendall</w:t>
+            </w:r>
+          </w:p>
+        </w:tc>
+      </w:tr>
+      <w:tr>
+        <w:tc>
+          <w:tcPr>
+            <w:tcW w:type="dxa" w:w="1440"/>
+          </w:tcPr>
+          <w:p>
+            <w:r>
+              <w:t>5</w:t>
+            </w:r>
+          </w:p>
+        </w:tc>
+        <w:tc>
+          <w:tcPr>
+            <w:tcW w:type="dxa" w:w="1440"/>
+          </w:tcPr>
+          <w:p>
+            <w:r>
+              <w:t>logreg-rf</w:t>
+            </w:r>
+          </w:p>
+        </w:tc>
+        <w:tc>
+          <w:tcPr>
+            <w:tcW w:type="dxa" w:w="1440"/>
+          </w:tcPr>
+          <w:p>
+            <w:r>
+              <w:t>0.4737</w:t>
+            </w:r>
+          </w:p>
+        </w:tc>
+        <w:tc>
+          <w:tcPr>
+            <w:tcW w:type="dxa" w:w="1440"/>
+          </w:tcPr>
+          <w:p>
+            <w:r>
+              <w:t>0.4579</w:t>
+            </w:r>
+          </w:p>
+        </w:tc>
+        <w:tc>
+          <w:tcPr>
+            <w:tcW w:type="dxa" w:w="1440"/>
+          </w:tcPr>
+          <w:p>
+            <w:r>
+              <w:t>0.4927</w:t>
+            </w:r>
+          </w:p>
+        </w:tc>
+        <w:tc>
+          <w:tcPr>
+            <w:tcW w:type="dxa" w:w="1440"/>
+          </w:tcPr>
+          <w:p>
+            <w:r>
+              <w:t>0.3162</w:t>
+            </w:r>
+          </w:p>
+        </w:tc>
+      </w:tr>
+      <w:tr>
+        <w:tc>
+          <w:tcPr>
+            <w:tcW w:type="dxa" w:w="1440"/>
+          </w:tcPr>
+          <w:p>
+            <w:r>
+              <w:t>5</w:t>
+            </w:r>
+          </w:p>
+        </w:tc>
+        <w:tc>
+          <w:tcPr>
+            <w:tcW w:type="dxa" w:w="1440"/>
+          </w:tcPr>
+          <w:p>
+            <w:r>
+              <w:t>logreg-hgb</w:t>
+            </w:r>
+          </w:p>
+        </w:tc>
+        <w:tc>
+          <w:tcPr>
+            <w:tcW w:type="dxa" w:w="1440"/>
+          </w:tcPr>
+          <w:p>
+            <w:r>
+              <w:t>0.3639</w:t>
+            </w:r>
+          </w:p>
+        </w:tc>
+        <w:tc>
+          <w:tcPr>
+            <w:tcW w:type="dxa" w:w="1440"/>
+          </w:tcPr>
+          <w:p>
+            <w:r>
+              <w:t>0.3523</w:t>
+            </w:r>
+          </w:p>
+        </w:tc>
+        <w:tc>
+          <w:tcPr>
+            <w:tcW w:type="dxa" w:w="1440"/>
+          </w:tcPr>
+          <w:p>
+            <w:r>
+              <w:t>0.3901</w:t>
+            </w:r>
+          </w:p>
+        </w:tc>
+        <w:tc>
+          <w:tcPr>
+            <w:tcW w:type="dxa" w:w="1440"/>
+          </w:tcPr>
+          <w:p>
+            <w:r>
+              <w:t>0.2593</w:t>
+            </w:r>
+          </w:p>
+        </w:tc>
+      </w:tr>
+      <w:tr>
+        <w:tc>
+          <w:tcPr>
+            <w:tcW w:type="dxa" w:w="1440"/>
+          </w:tcPr>
+          <w:p>
+            <w:r>
+              <w:t>5</w:t>
+            </w:r>
+          </w:p>
+        </w:tc>
+        <w:tc>
+          <w:tcPr>
+            <w:tcW w:type="dxa" w:w="1440"/>
+          </w:tcPr>
+          <w:p>
+            <w:r>
+              <w:t>rf-hgb</w:t>
+            </w:r>
+          </w:p>
+        </w:tc>
+        <w:tc>
+          <w:tcPr>
+            <w:tcW w:type="dxa" w:w="1440"/>
+          </w:tcPr>
+          <w:p>
+            <w:r>
+              <w:t>0.9127</w:t>
+            </w:r>
+          </w:p>
+        </w:tc>
+        <w:tc>
+          <w:tcPr>
+            <w:tcW w:type="dxa" w:w="1440"/>
+          </w:tcPr>
+          <w:p>
+            <w:r>
+              <w:t>0.9048</w:t>
+            </w:r>
+          </w:p>
+        </w:tc>
+        <w:tc>
+          <w:tcPr>
+            <w:tcW w:type="dxa" w:w="1440"/>
+          </w:tcPr>
+          <w:p>
+            <w:r>
+              <w:t>0.9237</w:t>
+            </w:r>
+          </w:p>
+        </w:tc>
+        <w:tc>
+          <w:tcPr>
+            <w:tcW w:type="dxa" w:w="1440"/>
+          </w:tcPr>
+          <w:p>
+            <w:r>
+              <w:t>0.7493</w:t>
+            </w:r>
+          </w:p>
+        </w:tc>
+      </w:tr>
+      <w:tr>
+        <w:tc>
+          <w:tcPr>
+            <w:tcW w:type="dxa" w:w="1440"/>
+          </w:tcPr>
+          <w:p>
+            <w:r>
+              <w:t>10</w:t>
+            </w:r>
+          </w:p>
+        </w:tc>
+        <w:tc>
+          <w:tcPr>
+            <w:tcW w:type="dxa" w:w="1440"/>
+          </w:tcPr>
+          <w:p>
+            <w:r>
+              <w:t>logreg-rf</w:t>
+            </w:r>
+          </w:p>
+        </w:tc>
+        <w:tc>
+          <w:tcPr>
+            <w:tcW w:type="dxa" w:w="1440"/>
+          </w:tcPr>
+          <w:p>
+            <w:r>
+              <w:t>0.5598</w:t>
+            </w:r>
+          </w:p>
+        </w:tc>
+        <w:tc>
+          <w:tcPr>
+            <w:tcW w:type="dxa" w:w="1440"/>
+          </w:tcPr>
+          <w:p>
+            <w:r>
+              <w:t>0.5415</w:t>
+            </w:r>
+          </w:p>
+        </w:tc>
+        <w:tc>
+          <w:tcPr>
+            <w:tcW w:type="dxa" w:w="1440"/>
+          </w:tcPr>
+          <w:p>
+            <w:r>
+              <w:t>0.5782</w:t>
+            </w:r>
+          </w:p>
+        </w:tc>
+        <w:tc>
+          <w:tcPr>
+            <w:tcW w:type="dxa" w:w="1440"/>
+          </w:tcPr>
+          <w:p>
+            <w:r>
+              <w:t>0.3960</w:t>
+            </w:r>
+          </w:p>
+        </w:tc>
+      </w:tr>
+      <w:tr>
+        <w:tc>
+          <w:tcPr>
+            <w:tcW w:type="dxa" w:w="1440"/>
+          </w:tcPr>
+          <w:p>
+            <w:r>
+              <w:t>10</w:t>
+            </w:r>
+          </w:p>
+        </w:tc>
+        <w:tc>
+          <w:tcPr>
+            <w:tcW w:type="dxa" w:w="1440"/>
+          </w:tcPr>
+          <w:p>
+            <w:r>
+              <w:t>logreg-hgb</w:t>
+            </w:r>
+          </w:p>
+        </w:tc>
+        <w:tc>
+          <w:tcPr>
+            <w:tcW w:type="dxa" w:w="1440"/>
+          </w:tcPr>
+          <w:p>
+            <w:r>
+              <w:t>0.5305</w:t>
+            </w:r>
+          </w:p>
+        </w:tc>
+        <w:tc>
+          <w:tcPr>
+            <w:tcW w:type="dxa" w:w="1440"/>
+          </w:tcPr>
+          <w:p>
+            <w:r>
+              <w:t>0.5128</w:t>
+            </w:r>
+          </w:p>
+        </w:tc>
+        <w:tc>
+          <w:tcPr>
+            <w:tcW w:type="dxa" w:w="1440"/>
+          </w:tcPr>
+          <w:p>
+            <w:r>
+              <w:t>0.5592</w:t>
+            </w:r>
+          </w:p>
+        </w:tc>
+        <w:tc>
+          <w:tcPr>
+            <w:tcW w:type="dxa" w:w="1440"/>
+          </w:tcPr>
+          <w:p>
+            <w:r>
+              <w:t>0.4017</w:t>
+            </w:r>
+          </w:p>
+        </w:tc>
+      </w:tr>
+      <w:tr>
+        <w:tc>
+          <w:tcPr>
+            <w:tcW w:type="dxa" w:w="1440"/>
+          </w:tcPr>
+          <w:p>
+            <w:r>
+              <w:t>10</w:t>
+            </w:r>
+          </w:p>
+        </w:tc>
+        <w:tc>
+          <w:tcPr>
+            <w:tcW w:type="dxa" w:w="1440"/>
+          </w:tcPr>
+          <w:p>
+            <w:r>
+              <w:t>rf-hgb</w:t>
+            </w:r>
+          </w:p>
+        </w:tc>
+        <w:tc>
+          <w:tcPr>
+            <w:tcW w:type="dxa" w:w="1440"/>
+          </w:tcPr>
+          <w:p>
+            <w:r>
+              <w:t>0.7418</w:t>
+            </w:r>
+          </w:p>
+        </w:tc>
+        <w:tc>
+          <w:tcPr>
+            <w:tcW w:type="dxa" w:w="1440"/>
+          </w:tcPr>
+          <w:p>
+            <w:r>
+              <w:t>0.7192</w:t>
+            </w:r>
+          </w:p>
+        </w:tc>
+        <w:tc>
+          <w:tcPr>
+            <w:tcW w:type="dxa" w:w="1440"/>
+          </w:tcPr>
+          <w:p>
+            <w:r>
+              <w:t>0.7668</w:t>
+            </w:r>
+          </w:p>
+        </w:tc>
+        <w:tc>
+          <w:tcPr>
+            <w:tcW w:type="dxa" w:w="1440"/>
+          </w:tcPr>
+          <w:p>
+            <w:r>
+              <w:t>0.5726</w:t>
+            </w:r>
+          </w:p>
+        </w:tc>
+      </w:tr>
+      <w:tr>
+        <w:tc>
+          <w:tcPr>
+            <w:tcW w:type="dxa" w:w="1440"/>
+          </w:tcPr>
+          <w:p>
+            <w:r>
+              <w:t>15</w:t>
+            </w:r>
+          </w:p>
+        </w:tc>
+        <w:tc>
+          <w:tcPr>
+            <w:tcW w:type="dxa" w:w="1440"/>
+          </w:tcPr>
+          <w:p>
+            <w:r>
+              <w:t>logreg-rf</w:t>
+            </w:r>
+          </w:p>
+        </w:tc>
+        <w:tc>
+          <w:tcPr>
+            <w:tcW w:type="dxa" w:w="1440"/>
+          </w:tcPr>
+          <w:p>
+            <w:r>
+              <w:t>0.6960</w:t>
+            </w:r>
+          </w:p>
+        </w:tc>
+        <w:tc>
+          <w:tcPr>
+            <w:tcW w:type="dxa" w:w="1440"/>
+          </w:tcPr>
+          <w:p>
+            <w:r>
+              <w:t>0.6667</w:t>
+            </w:r>
+          </w:p>
+        </w:tc>
+        <w:tc>
+          <w:tcPr>
+            <w:tcW w:type="dxa" w:w="1440"/>
+          </w:tcPr>
+          <w:p>
+            <w:r>
+              <w:t>0.7039</w:t>
+            </w:r>
+          </w:p>
+        </w:tc>
+        <w:tc>
+          <w:tcPr>
+            <w:tcW w:type="dxa" w:w="1440"/>
+          </w:tcPr>
+          <w:p>
+            <w:r>
+              <w:t>0.5214</w:t>
+            </w:r>
+          </w:p>
+        </w:tc>
+      </w:tr>
+      <w:tr>
+        <w:tc>
+          <w:tcPr>
+            <w:tcW w:type="dxa" w:w="1440"/>
+          </w:tcPr>
+          <w:p>
+            <w:r>
+              <w:t>15</w:t>
+            </w:r>
+          </w:p>
+        </w:tc>
+        <w:tc>
+          <w:tcPr>
+            <w:tcW w:type="dxa" w:w="1440"/>
+          </w:tcPr>
+          <w:p>
+            <w:r>
+              <w:t>logreg-hgb</w:t>
+            </w:r>
+          </w:p>
+        </w:tc>
+        <w:tc>
+          <w:tcPr>
+            <w:tcW w:type="dxa" w:w="1440"/>
+          </w:tcPr>
+          <w:p>
+            <w:r>
+              <w:t>0.5696</w:t>
+            </w:r>
+          </w:p>
+        </w:tc>
+        <w:tc>
+          <w:tcPr>
+            <w:tcW w:type="dxa" w:w="1440"/>
+          </w:tcPr>
+          <w:p>
+            <w:r>
+              <w:t>0.5531</w:t>
+            </w:r>
+          </w:p>
+        </w:tc>
+        <w:tc>
+          <w:tcPr>
+            <w:tcW w:type="dxa" w:w="1440"/>
+          </w:tcPr>
+          <w:p>
+            <w:r>
+              <w:t>0.6013</w:t>
+            </w:r>
+          </w:p>
+        </w:tc>
+        <w:tc>
+          <w:tcPr>
+            <w:tcW w:type="dxa" w:w="1440"/>
+          </w:tcPr>
+          <w:p>
+            <w:r>
+              <w:t>0.4245</w:t>
+            </w:r>
+          </w:p>
+        </w:tc>
+      </w:tr>
+      <w:tr>
+        <w:tc>
+          <w:tcPr>
+            <w:tcW w:type="dxa" w:w="1440"/>
+          </w:tcPr>
+          <w:p>
+            <w:r>
+              <w:t>15</w:t>
+            </w:r>
+          </w:p>
+        </w:tc>
+        <w:tc>
+          <w:tcPr>
+            <w:tcW w:type="dxa" w:w="1440"/>
+          </w:tcPr>
+          <w:p>
+            <w:r>
+              <w:t>rf-hgb</w:t>
+            </w:r>
+          </w:p>
+        </w:tc>
+        <w:tc>
+          <w:tcPr>
+            <w:tcW w:type="dxa" w:w="1440"/>
+          </w:tcPr>
+          <w:p>
+            <w:r>
+              <w:t>0.6697</w:t>
+            </w:r>
+          </w:p>
+        </w:tc>
+        <w:tc>
+          <w:tcPr>
+            <w:tcW w:type="dxa" w:w="1440"/>
+          </w:tcPr>
+          <w:p>
+            <w:r>
+              <w:t>0.6587</w:t>
+            </w:r>
+          </w:p>
+        </w:tc>
+        <w:tc>
+          <w:tcPr>
+            <w:tcW w:type="dxa" w:w="1440"/>
+          </w:tcPr>
+          <w:p>
+            <w:r>
+              <w:t>0.7076</w:t>
+            </w:r>
+          </w:p>
+        </w:tc>
+        <w:tc>
+          <w:tcPr>
+            <w:tcW w:type="dxa" w:w="1440"/>
+          </w:tcPr>
+          <w:p>
+            <w:r>
+              <w:t>0.5043</w:t>
+            </w:r>
+          </w:p>
+        </w:tc>
+      </w:tr>
+      <w:tr>
+        <w:tc>
+          <w:tcPr>
+            <w:tcW w:type="dxa" w:w="1440"/>
+          </w:tcPr>
+          <w:p>
+            <w:r>
+              <w:t>25</w:t>
+            </w:r>
+          </w:p>
+        </w:tc>
+        <w:tc>
+          <w:tcPr>
+            <w:tcW w:type="dxa" w:w="1440"/>
+          </w:tcPr>
+          <w:p>
+            <w:r>
+              <w:t>logreg-rf</w:t>
+            </w:r>
+          </w:p>
+        </w:tc>
+        <w:tc>
+          <w:tcPr>
+            <w:tcW w:type="dxa" w:w="1440"/>
+          </w:tcPr>
+          <w:p>
+            <w:r>
+              <w:t>0.7350</w:t>
+            </w:r>
+          </w:p>
+        </w:tc>
+        <w:tc>
+          <w:tcPr>
+            <w:tcW w:type="dxa" w:w="1440"/>
+          </w:tcPr>
+          <w:p>
+            <w:r>
+              <w:t>0.7216</w:t>
+            </w:r>
+          </w:p>
+        </w:tc>
+        <w:tc>
+          <w:tcPr>
+            <w:tcW w:type="dxa" w:w="1440"/>
+          </w:tcPr>
+          <w:p>
+            <w:r>
+              <w:t>0.7527</w:t>
+            </w:r>
+          </w:p>
+        </w:tc>
+        <w:tc>
+          <w:tcPr>
+            <w:tcW w:type="dxa" w:w="1440"/>
+          </w:tcPr>
+          <w:p>
+            <w:r>
+              <w:t>0.5442</w:t>
+            </w:r>
+          </w:p>
+        </w:tc>
+      </w:tr>
+      <w:tr>
+        <w:tc>
+          <w:tcPr>
+            <w:tcW w:type="dxa" w:w="1440"/>
+          </w:tcPr>
+          <w:p>
+            <w:r>
+              <w:t>25</w:t>
+            </w:r>
+          </w:p>
+        </w:tc>
+        <w:tc>
+          <w:tcPr>
+            <w:tcW w:type="dxa" w:w="1440"/>
+          </w:tcPr>
+          <w:p>
+            <w:r>
+              <w:t>logreg-hgb</w:t>
+            </w:r>
+          </w:p>
+        </w:tc>
+        <w:tc>
+          <w:tcPr>
+            <w:tcW w:type="dxa" w:w="1440"/>
+          </w:tcPr>
+          <w:p>
+            <w:r>
+              <w:t>0.6532</w:t>
+            </w:r>
+          </w:p>
+        </w:tc>
+        <w:tc>
+          <w:tcPr>
+            <w:tcW w:type="dxa" w:w="1440"/>
+          </w:tcPr>
+          <w:p>
+            <w:r>
+              <w:t>0.6386</w:t>
+            </w:r>
+          </w:p>
+        </w:tc>
+        <w:tc>
+          <w:tcPr>
+            <w:tcW w:type="dxa" w:w="1440"/>
+          </w:tcPr>
+          <w:p>
+            <w:r>
+              <w:t>0.6654</w:t>
+            </w:r>
+          </w:p>
+        </w:tc>
+        <w:tc>
+          <w:tcPr>
+            <w:tcW w:type="dxa" w:w="1440"/>
+          </w:tcPr>
+          <w:p>
+            <w:r>
+              <w:t>0.5271</w:t>
+            </w:r>
+          </w:p>
+        </w:tc>
+      </w:tr>
+      <w:tr>
+        <w:tc>
+          <w:tcPr>
+            <w:tcW w:type="dxa" w:w="1440"/>
+          </w:tcPr>
+          <w:p>
+            <w:r>
+              <w:t>25</w:t>
+            </w:r>
+          </w:p>
+        </w:tc>
+        <w:tc>
+          <w:tcPr>
+            <w:tcW w:type="dxa" w:w="1440"/>
+          </w:tcPr>
+          <w:p>
+            <w:r>
+              <w:t>rf-hgb</w:t>
+            </w:r>
+          </w:p>
+        </w:tc>
+        <w:tc>
+          <w:tcPr>
+            <w:tcW w:type="dxa" w:w="1440"/>
+          </w:tcPr>
+          <w:p>
+            <w:r>
+              <w:t>0.7888</w:t>
+            </w:r>
+          </w:p>
+        </w:tc>
+        <w:tc>
+          <w:tcPr>
+            <w:tcW w:type="dxa" w:w="1440"/>
+          </w:tcPr>
+          <w:p>
+            <w:r>
+              <w:t>0.7705</w:t>
+            </w:r>
+          </w:p>
+        </w:tc>
+        <w:tc>
+          <w:tcPr>
+            <w:tcW w:type="dxa" w:w="1440"/>
+          </w:tcPr>
+          <w:p>
+            <w:r>
+              <w:t>0.7991</w:t>
+            </w:r>
+          </w:p>
+        </w:tc>
+        <w:tc>
+          <w:tcPr>
+            <w:tcW w:type="dxa" w:w="1440"/>
+          </w:tcPr>
+          <w:p>
+            <w:r>
+              <w:t>0.6068</w:t>
+            </w:r>
+          </w:p>
+        </w:tc>
+      </w:tr>
+    </w:tbl>
+    <w:p>
+      <w:r>
+        <w:t>Deletion faithfulness, overall and by subgroup (95% CI on the gaps):</w:t>
+      </w:r>
+    </w:p>
+    <w:tbl>
+      <w:tblPr>
+        <w:tblStyle w:val="LightGrid-Accent1"/>
+        <w:tblW w:type="auto" w:w="0"/>
+        <w:tblLook w:firstColumn="1" w:firstRow="1" w:lastColumn="0" w:lastRow="0" w:noHBand="0" w:noVBand="1" w:val="04A0"/>
+      </w:tblPr>
+      <w:tblGrid>
+        <w:gridCol w:w="1234"/>
+        <w:gridCol w:w="1234"/>
+        <w:gridCol w:w="1234"/>
+        <w:gridCol w:w="1234"/>
+        <w:gridCol w:w="1234"/>
+        <w:gridCol w:w="1234"/>
+        <w:gridCol w:w="1234"/>
+      </w:tblGrid>
+      <w:tr>
+        <w:tc>
+          <w:tcPr>
+            <w:tcW w:type="dxa" w:w="1234"/>
+          </w:tcPr>
+          <w:p>
+            <w:r>
+              <w:t>cutoff_week</w:t>
+            </w:r>
+          </w:p>
+        </w:tc>
+        <w:tc>
+          <w:tcPr>
+            <w:tcW w:type="dxa" w:w="1234"/>
+          </w:tcPr>
+          <w:p>
+            <w:r>
+              <w:t>model</w:t>
+            </w:r>
+          </w:p>
+        </w:tc>
+        <w:tc>
+          <w:tcPr>
+            <w:tcW w:type="dxa" w:w="1234"/>
+          </w:tcPr>
+          <w:p>
+            <w:r>
+              <w:t>del_aopc</w:t>
+            </w:r>
+          </w:p>
+        </w:tc>
+        <w:tc>
+          <w:tcPr>
+            <w:tcW w:type="dxa" w:w="1234"/>
+          </w:tcPr>
+          <w:p>
+            <w:r>
+              <w:t>gap_imd_deprived_minus_affluent</w:t>
+            </w:r>
+          </w:p>
+        </w:tc>
+        <w:tc>
+          <w:tcPr>
+            <w:tcW w:type="dxa" w:w="1234"/>
+          </w:tcPr>
+          <w:p>
+            <w:r>
+              <w:t>gap_imd_lo</w:t>
+            </w:r>
+          </w:p>
+        </w:tc>
+        <w:tc>
+          <w:tcPr>
+            <w:tcW w:type="dxa" w:w="1234"/>
+          </w:tcPr>
+          <w:p>
+            <w:r>
+              <w:t>gap_imd_hi</w:t>
+            </w:r>
+          </w:p>
+        </w:tc>
+        <w:tc>
+          <w:tcPr>
+            <w:tcW w:type="dxa" w:w="1234"/>
+          </w:tcPr>
+          <w:p>
+            <w:r>
+              <w:t>gap_disab_Y_minus_N</w:t>
+            </w:r>
+          </w:p>
+        </w:tc>
+      </w:tr>
+      <w:tr>
+        <w:tc>
+          <w:tcPr>
+            <w:tcW w:type="dxa" w:w="1234"/>
+          </w:tcPr>
+          <w:p>
+            <w:r>
+              <w:t>5</w:t>
+            </w:r>
+          </w:p>
+        </w:tc>
+        <w:tc>
+          <w:tcPr>
+            <w:tcW w:type="dxa" w:w="1234"/>
+          </w:tcPr>
+          <w:p>
+            <w:r>
+              <w:t>logreg</w:t>
+            </w:r>
+          </w:p>
+        </w:tc>
+        <w:tc>
+          <w:tcPr>
+            <w:tcW w:type="dxa" w:w="1234"/>
+          </w:tcPr>
+          <w:p>
+            <w:r>
+              <w:t>0.0295</w:t>
+            </w:r>
+          </w:p>
+        </w:tc>
+        <w:tc>
+          <w:tcPr>
+            <w:tcW w:type="dxa" w:w="1234"/>
+          </w:tcPr>
+          <w:p>
+            <w:r>
+              <w:t>0.0733</w:t>
+            </w:r>
+          </w:p>
+        </w:tc>
+        <w:tc>
+          <w:tcPr>
+            <w:tcW w:type="dxa" w:w="1234"/>
+          </w:tcPr>
+          <w:p>
+            <w:r>
+              <w:t>0.0389</w:t>
+            </w:r>
+          </w:p>
+        </w:tc>
+        <w:tc>
+          <w:tcPr>
+            <w:tcW w:type="dxa" w:w="1234"/>
+          </w:tcPr>
+          <w:p>
+            <w:r>
+              <w:t>0.1056</w:t>
+            </w:r>
+          </w:p>
+        </w:tc>
+        <w:tc>
+          <w:tcPr>
+            <w:tcW w:type="dxa" w:w="1234"/>
+          </w:tcPr>
+          <w:p>
+            <w:r>
+              <w:t>0.0472</w:t>
+            </w:r>
+          </w:p>
+        </w:tc>
+      </w:tr>
+      <w:tr>
+        <w:tc>
+          <w:tcPr>
+            <w:tcW w:type="dxa" w:w="1234"/>
+          </w:tcPr>
+          <w:p>
+            <w:r>
+              <w:t>5</w:t>
+            </w:r>
+          </w:p>
+        </w:tc>
+        <w:tc>
+          <w:tcPr>
+            <w:tcW w:type="dxa" w:w="1234"/>
+          </w:tcPr>
+          <w:p>
+            <w:r>
+              <w:t>rf</w:t>
+            </w:r>
+          </w:p>
+        </w:tc>
+        <w:tc>
+          <w:tcPr>
+            <w:tcW w:type="dxa" w:w="1234"/>
+          </w:tcPr>
+          <w:p>
+            <w:r>
+              <w:t>0.0443</w:t>
+            </w:r>
+          </w:p>
+        </w:tc>
+        <w:tc>
+          <w:tcPr>
+            <w:tcW w:type="dxa" w:w="1234"/>
+          </w:tcPr>
+          <w:p>
+            <w:r>
+              <w:t>0.0480</w:t>
+            </w:r>
+          </w:p>
+        </w:tc>
+        <w:tc>
+          <w:tcPr>
+            <w:tcW w:type="dxa" w:w="1234"/>
+          </w:tcPr>
+          <w:p>
+            <w:r>
+              <w:t>0.0205</w:t>
+            </w:r>
+          </w:p>
+        </w:tc>
+        <w:tc>
+          <w:tcPr>
+            <w:tcW w:type="dxa" w:w="1234"/>
+          </w:tcPr>
+          <w:p>
+            <w:r>
+              <w:t>0.0785</w:t>
+            </w:r>
+          </w:p>
+        </w:tc>
+        <w:tc>
+          <w:tcPr>
+            <w:tcW w:type="dxa" w:w="1234"/>
+          </w:tcPr>
+          <w:p>
+            <w:r>
+              <w:t>0.0299</w:t>
+            </w:r>
+          </w:p>
+        </w:tc>
+      </w:tr>
+      <w:tr>
+        <w:tc>
+          <w:tcPr>
+            <w:tcW w:type="dxa" w:w="1234"/>
+          </w:tcPr>
+          <w:p>
+            <w:r>
+              <w:t>5</w:t>
+            </w:r>
+          </w:p>
+        </w:tc>
+        <w:tc>
+          <w:tcPr>
+            <w:tcW w:type="dxa" w:w="1234"/>
+          </w:tcPr>
+          <w:p>
+            <w:r>
+              <w:t>hgb</w:t>
+            </w:r>
+          </w:p>
+        </w:tc>
+        <w:tc>
+          <w:tcPr>
+            <w:tcW w:type="dxa" w:w="1234"/>
+          </w:tcPr>
+          <w:p>
+            <w:r>
+              <w:t>0.0556</w:t>
+            </w:r>
+          </w:p>
+        </w:tc>
+        <w:tc>
+          <w:tcPr>
+            <w:tcW w:type="dxa" w:w="1234"/>
+          </w:tcPr>
+          <w:p>
+            <w:r>
+              <w:t>0.0452</w:t>
+            </w:r>
+          </w:p>
+        </w:tc>
+        <w:tc>
+          <w:tcPr>
+            <w:tcW w:type="dxa" w:w="1234"/>
+          </w:tcPr>
+          <w:p>
+            <w:r>
+              <w:t>0.0166</w:t>
+            </w:r>
+          </w:p>
+        </w:tc>
+        <w:tc>
+          <w:tcPr>
+            <w:tcW w:type="dxa" w:w="1234"/>
+          </w:tcPr>
+          <w:p>
+            <w:r>
+              <w:t>0.0751</w:t>
+            </w:r>
+          </w:p>
+        </w:tc>
+        <w:tc>
+          <w:tcPr>
+            <w:tcW w:type="dxa" w:w="1234"/>
+          </w:tcPr>
+          <w:p>
+            <w:r>
+              <w:t>0.0168</w:t>
+            </w:r>
+          </w:p>
+        </w:tc>
+      </w:tr>
+      <w:tr>
+        <w:tc>
+          <w:tcPr>
+            <w:tcW w:type="dxa" w:w="1234"/>
+          </w:tcPr>
+          <w:p>
+            <w:r>
+              <w:t>10</w:t>
+            </w:r>
+          </w:p>
+        </w:tc>
+        <w:tc>
+          <w:tcPr>
+            <w:tcW w:type="dxa" w:w="1234"/>
+          </w:tcPr>
+          <w:p>
+            <w:r>
+              <w:t>logreg</w:t>
+            </w:r>
+          </w:p>
+        </w:tc>
+        <w:tc>
+          <w:tcPr>
+            <w:tcW w:type="dxa" w:w="1234"/>
+          </w:tcPr>
+          <w:p>
+            <w:r>
+              <w:t>-0.0497</w:t>
+            </w:r>
+          </w:p>
+        </w:tc>
+        <w:tc>
+          <w:tcPr>
+            <w:tcW w:type="dxa" w:w="1234"/>
+          </w:tcPr>
+          <w:p>
+            <w:r>
+              <w:t>0.0861</w:t>
+            </w:r>
+          </w:p>
+        </w:tc>
+        <w:tc>
+          <w:tcPr>
+            <w:tcW w:type="dxa" w:w="1234"/>
+          </w:tcPr>
+          <w:p>
+            <w:r>
+              <w:t>0.0459</w:t>
+            </w:r>
+          </w:p>
+        </w:tc>
+        <w:tc>
+          <w:tcPr>
+            <w:tcW w:type="dxa" w:w="1234"/>
+          </w:tcPr>
+          <w:p>
+            <w:r>
+              <w:t>0.1292</w:t>
+            </w:r>
+          </w:p>
+        </w:tc>
+        <w:tc>
+          <w:tcPr>
+            <w:tcW w:type="dxa" w:w="1234"/>
+          </w:tcPr>
+          <w:p>
+            <w:r>
+              <w:t>0.0627</w:t>
+            </w:r>
+          </w:p>
+        </w:tc>
+      </w:tr>
+      <w:tr>
+        <w:tc>
+          <w:tcPr>
+            <w:tcW w:type="dxa" w:w="1234"/>
+          </w:tcPr>
+          <w:p>
+            <w:r>
+              <w:t>10</w:t>
+            </w:r>
+          </w:p>
+        </w:tc>
+        <w:tc>
+          <w:tcPr>
+            <w:tcW w:type="dxa" w:w="1234"/>
+          </w:tcPr>
+          <w:p>
+            <w:r>
+              <w:t>rf</w:t>
+            </w:r>
+          </w:p>
+        </w:tc>
+        <w:tc>
+          <w:tcPr>
+            <w:tcW w:type="dxa" w:w="1234"/>
+          </w:tcPr>
+          <w:p>
+            <w:r>
+              <w:t>0.1022</w:t>
+            </w:r>
+          </w:p>
+        </w:tc>
+        <w:tc>
+          <w:tcPr>
+            <w:tcW w:type="dxa" w:w="1234"/>
+          </w:tcPr>
+          <w:p>
+            <w:r>
+              <w:t>0.0651</w:t>
+            </w:r>
+          </w:p>
+        </w:tc>
+        <w:tc>
+          <w:tcPr>
+            <w:tcW w:type="dxa" w:w="1234"/>
+          </w:tcPr>
+          <w:p>
+            <w:r>
+              <w:t>0.0326</w:t>
+            </w:r>
+          </w:p>
+        </w:tc>
+        <w:tc>
+          <w:tcPr>
+            <w:tcW w:type="dxa" w:w="1234"/>
+          </w:tcPr>
+          <w:p>
+            <w:r>
+              <w:t>0.0989</w:t>
+            </w:r>
+          </w:p>
+        </w:tc>
+        <w:tc>
+          <w:tcPr>
+            <w:tcW w:type="dxa" w:w="1234"/>
+          </w:tcPr>
+          <w:p>
+            <w:r>
+              <w:t>0.0525</w:t>
+            </w:r>
+          </w:p>
+        </w:tc>
+      </w:tr>
+      <w:tr>
+        <w:tc>
+          <w:tcPr>
+            <w:tcW w:type="dxa" w:w="1234"/>
+          </w:tcPr>
+          <w:p>
+            <w:r>
+              <w:t>10</w:t>
+            </w:r>
+          </w:p>
+        </w:tc>
+        <w:tc>
+          <w:tcPr>
+            <w:tcW w:type="dxa" w:w="1234"/>
+          </w:tcPr>
+          <w:p>
+            <w:r>
+              <w:t>hgb</w:t>
+            </w:r>
+          </w:p>
+        </w:tc>
+        <w:tc>
+          <w:tcPr>
+            <w:tcW w:type="dxa" w:w="1234"/>
+          </w:tcPr>
+          <w:p>
+            <w:r>
+              <w:t>0.1965</w:t>
+            </w:r>
+          </w:p>
+        </w:tc>
+        <w:tc>
+          <w:tcPr>
+            <w:tcW w:type="dxa" w:w="1234"/>
+          </w:tcPr>
+          <w:p>
+            <w:r>
+              <w:t>0.0736</w:t>
+            </w:r>
+          </w:p>
+        </w:tc>
+        <w:tc>
+          <w:tcPr>
+            <w:tcW w:type="dxa" w:w="1234"/>
+          </w:tcPr>
+          <w:p>
+            <w:r>
+              <w:t>0.0353</w:t>
+            </w:r>
+          </w:p>
+        </w:tc>
+        <w:tc>
+          <w:tcPr>
+            <w:tcW w:type="dxa" w:w="1234"/>
+          </w:tcPr>
+          <w:p>
+            <w:r>
+              <w:t>0.1148</w:t>
+            </w:r>
+          </w:p>
+        </w:tc>
+        <w:tc>
+          <w:tcPr>
+            <w:tcW w:type="dxa" w:w="1234"/>
+          </w:tcPr>
+          <w:p>
+            <w:r>
+              <w:t>0.0499</w:t>
+            </w:r>
+          </w:p>
+        </w:tc>
+      </w:tr>
+      <w:tr>
+        <w:tc>
+          <w:tcPr>
+            <w:tcW w:type="dxa" w:w="1234"/>
+          </w:tcPr>
+          <w:p>
+            <w:r>
+              <w:t>15</w:t>
+            </w:r>
+          </w:p>
+        </w:tc>
+        <w:tc>
+          <w:tcPr>
+            <w:tcW w:type="dxa" w:w="1234"/>
+          </w:tcPr>
+          <w:p>
+            <w:r>
+              <w:t>logreg</w:t>
+            </w:r>
+          </w:p>
+        </w:tc>
+        <w:tc>
+          <w:tcPr>
+            <w:tcW w:type="dxa" w:w="1234"/>
+          </w:tcPr>
+          <w:p>
+            <w:r>
+              <w:t>-0.0604</w:t>
+            </w:r>
+          </w:p>
+        </w:tc>
+        <w:tc>
+          <w:tcPr>
+            <w:tcW w:type="dxa" w:w="1234"/>
+          </w:tcPr>
+          <w:p>
+            <w:r>
+              <w:t>0.0977</w:t>
+            </w:r>
+          </w:p>
+        </w:tc>
+        <w:tc>
+          <w:tcPr>
+            <w:tcW w:type="dxa" w:w="1234"/>
+          </w:tcPr>
+          <w:p>
+            <w:r>
+              <w:t>0.0547</w:t>
+            </w:r>
+          </w:p>
+        </w:tc>
+        <w:tc>
+          <w:tcPr>
+            <w:tcW w:type="dxa" w:w="1234"/>
+          </w:tcPr>
+          <w:p>
+            <w:r>
+              <w:t>0.1441</w:t>
+            </w:r>
+          </w:p>
+        </w:tc>
+        <w:tc>
+          <w:tcPr>
+            <w:tcW w:type="dxa" w:w="1234"/>
+          </w:tcPr>
+          <w:p>
+            <w:r>
+              <w:t>0.0427</w:t>
+            </w:r>
+          </w:p>
+        </w:tc>
+      </w:tr>
+      <w:tr>
+        <w:tc>
+          <w:tcPr>
+            <w:tcW w:type="dxa" w:w="1234"/>
+          </w:tcPr>
+          <w:p>
+            <w:r>
+              <w:t>15</w:t>
+            </w:r>
+          </w:p>
+        </w:tc>
+        <w:tc>
+          <w:tcPr>
+            <w:tcW w:type="dxa" w:w="1234"/>
+          </w:tcPr>
+          <w:p>
+            <w:r>
+              <w:t>rf</w:t>
+            </w:r>
+          </w:p>
+        </w:tc>
+        <w:tc>
+          <w:tcPr>
+            <w:tcW w:type="dxa" w:w="1234"/>
+          </w:tcPr>
+          <w:p>
+            <w:r>
+              <w:t>0.1436</w:t>
+            </w:r>
+          </w:p>
+        </w:tc>
+        <w:tc>
+          <w:tcPr>
+            <w:tcW w:type="dxa" w:w="1234"/>
+          </w:tcPr>
+          <w:p>
+            <w:r>
+              <w:t>0.0801</w:t>
+            </w:r>
+          </w:p>
+        </w:tc>
+        <w:tc>
+          <w:tcPr>
+            <w:tcW w:type="dxa" w:w="1234"/>
+          </w:tcPr>
+          <w:p>
+            <w:r>
+              <w:t>0.0445</w:t>
+            </w:r>
+          </w:p>
+        </w:tc>
+        <w:tc>
+          <w:tcPr>
+            <w:tcW w:type="dxa" w:w="1234"/>
+          </w:tcPr>
+          <w:p>
+            <w:r>
+              <w:t>0.1177</w:t>
+            </w:r>
+          </w:p>
+        </w:tc>
+        <w:tc>
+          <w:tcPr>
+            <w:tcW w:type="dxa" w:w="1234"/>
+          </w:tcPr>
+          <w:p>
+            <w:r>
+              <w:t>0.0646</w:t>
+            </w:r>
+          </w:p>
+        </w:tc>
+      </w:tr>
+      <w:tr>
+        <w:tc>
+          <w:tcPr>
+            <w:tcW w:type="dxa" w:w="1234"/>
+          </w:tcPr>
+          <w:p>
+            <w:r>
+              <w:t>15</w:t>
+            </w:r>
+          </w:p>
+        </w:tc>
+        <w:tc>
+          <w:tcPr>
+            <w:tcW w:type="dxa" w:w="1234"/>
+          </w:tcPr>
+          <w:p>
+            <w:r>
+              <w:t>hgb</w:t>
+            </w:r>
+          </w:p>
+        </w:tc>
+        <w:tc>
+          <w:tcPr>
+            <w:tcW w:type="dxa" w:w="1234"/>
+          </w:tcPr>
+          <w:p>
+            <w:r>
+              <w:t>0.2277</w:t>
+            </w:r>
+          </w:p>
+        </w:tc>
+        <w:tc>
+          <w:tcPr>
+            <w:tcW w:type="dxa" w:w="1234"/>
+          </w:tcPr>
+          <w:p>
+            <w:r>
+              <w:t>0.1007</w:t>
+            </w:r>
+          </w:p>
+        </w:tc>
+        <w:tc>
+          <w:tcPr>
+            <w:tcW w:type="dxa" w:w="1234"/>
+          </w:tcPr>
+          <w:p>
+            <w:r>
+              <w:t>0.0595</w:t>
+            </w:r>
+          </w:p>
+        </w:tc>
+        <w:tc>
+          <w:tcPr>
+            <w:tcW w:type="dxa" w:w="1234"/>
+          </w:tcPr>
+          <w:p>
+            <w:r>
+              <w:t>0.1409</w:t>
+            </w:r>
+          </w:p>
+        </w:tc>
+        <w:tc>
+          <w:tcPr>
+            <w:tcW w:type="dxa" w:w="1234"/>
+          </w:tcPr>
+          <w:p>
+            <w:r>
+              <w:t>0.0685</w:t>
+            </w:r>
+          </w:p>
+        </w:tc>
+      </w:tr>
+      <w:tr>
+        <w:tc>
+          <w:tcPr>
+            <w:tcW w:type="dxa" w:w="1234"/>
+          </w:tcPr>
+          <w:p>
+            <w:r>
+              <w:t>25</w:t>
+            </w:r>
+          </w:p>
+        </w:tc>
+        <w:tc>
+          <w:tcPr>
+            <w:tcW w:type="dxa" w:w="1234"/>
+          </w:tcPr>
+          <w:p>
+            <w:r>
+              <w:t>logreg</w:t>
+            </w:r>
+          </w:p>
+        </w:tc>
+        <w:tc>
+          <w:tcPr>
+            <w:tcW w:type="dxa" w:w="1234"/>
+          </w:tcPr>
+          <w:p>
+            <w:r>
+              <w:t>-0.1043</w:t>
+            </w:r>
+          </w:p>
+        </w:tc>
+        <w:tc>
+          <w:tcPr>
+            <w:tcW w:type="dxa" w:w="1234"/>
+          </w:tcPr>
+          <w:p>
+            <w:r>
+              <w:t>0.0964</w:t>
+            </w:r>
+          </w:p>
+        </w:tc>
+        <w:tc>
+          <w:tcPr>
+            <w:tcW w:type="dxa" w:w="1234"/>
+          </w:tcPr>
+          <w:p>
+            <w:r>
+              <w:t>0.0551</w:t>
+            </w:r>
+          </w:p>
+        </w:tc>
+        <w:tc>
+          <w:tcPr>
+            <w:tcW w:type="dxa" w:w="1234"/>
+          </w:tcPr>
+          <w:p>
+            <w:r>
+              <w:t>0.1414</w:t>
+            </w:r>
+          </w:p>
+        </w:tc>
+        <w:tc>
+          <w:tcPr>
+            <w:tcW w:type="dxa" w:w="1234"/>
+          </w:tcPr>
+          <w:p>
+            <w:r>
+              <w:t>0.0321</w:t>
+            </w:r>
+          </w:p>
+        </w:tc>
+      </w:tr>
+      <w:tr>
+        <w:tc>
+          <w:tcPr>
+            <w:tcW w:type="dxa" w:w="1234"/>
+          </w:tcPr>
+          <w:p>
+            <w:r>
+              <w:t>25</w:t>
+            </w:r>
+          </w:p>
+        </w:tc>
+        <w:tc>
+          <w:tcPr>
+            <w:tcW w:type="dxa" w:w="1234"/>
+          </w:tcPr>
+          <w:p>
+            <w:r>
+              <w:t>rf</w:t>
+            </w:r>
+          </w:p>
+        </w:tc>
+        <w:tc>
+          <w:tcPr>
+            <w:tcW w:type="dxa" w:w="1234"/>
+          </w:tcPr>
+          <w:p>
+            <w:r>
+              <w:t>0.1441</w:t>
+            </w:r>
+          </w:p>
+        </w:tc>
+        <w:tc>
+          <w:tcPr>
+            <w:tcW w:type="dxa" w:w="1234"/>
+          </w:tcPr>
+          <w:p>
+            <w:r>
+              <w:t>0.0819</w:t>
+            </w:r>
+          </w:p>
+        </w:tc>
+        <w:tc>
+          <w:tcPr>
+            <w:tcW w:type="dxa" w:w="1234"/>
+          </w:tcPr>
+          <w:p>
+            <w:r>
+              <w:t>0.0458</w:t>
+            </w:r>
+          </w:p>
+        </w:tc>
+        <w:tc>
+          <w:tcPr>
+            <w:tcW w:type="dxa" w:w="1234"/>
+          </w:tcPr>
+          <w:p>
+            <w:r>
+              <w:t>0.1218</w:t>
+            </w:r>
+          </w:p>
+        </w:tc>
+        <w:tc>
+          <w:tcPr>
+            <w:tcW w:type="dxa" w:w="1234"/>
+          </w:tcPr>
+          <w:p>
+            <w:r>
+              <w:t>0.0556</w:t>
+            </w:r>
+          </w:p>
+        </w:tc>
+      </w:tr>
+      <w:tr>
+        <w:tc>
+          <w:tcPr>
+            <w:tcW w:type="dxa" w:w="1234"/>
+          </w:tcPr>
+          <w:p>
+            <w:r>
+              <w:t>25</w:t>
+            </w:r>
+          </w:p>
+        </w:tc>
+        <w:tc>
+          <w:tcPr>
+            <w:tcW w:type="dxa" w:w="1234"/>
+          </w:tcPr>
+          <w:p>
+            <w:r>
+              <w:t>hgb</w:t>
+            </w:r>
+          </w:p>
+        </w:tc>
+        <w:tc>
+          <w:tcPr>
+            <w:tcW w:type="dxa" w:w="1234"/>
+          </w:tcPr>
+          <w:p>
+            <w:r>
+              <w:t>0.2560</w:t>
+            </w:r>
+          </w:p>
+        </w:tc>
+        <w:tc>
+          <w:tcPr>
+            <w:tcW w:type="dxa" w:w="1234"/>
+          </w:tcPr>
+          <w:p>
+            <w:r>
+              <w:t>0.1083</w:t>
+            </w:r>
+          </w:p>
+        </w:tc>
+        <w:tc>
+          <w:tcPr>
+            <w:tcW w:type="dxa" w:w="1234"/>
+          </w:tcPr>
+          <w:p>
+            <w:r>
+              <w:t>0.0640</w:t>
+            </w:r>
+          </w:p>
+        </w:tc>
+        <w:tc>
+          <w:tcPr>
+            <w:tcW w:type="dxa" w:w="1234"/>
+          </w:tcPr>
+          <w:p>
+            <w:r>
+              <w:t>0.1557</w:t>
+            </w:r>
+          </w:p>
+        </w:tc>
+        <w:tc>
+          <w:tcPr>
+            <w:tcW w:type="dxa" w:w="1234"/>
+          </w:tcPr>
+          <w:p>
+            <w:r>
+              <w:t>0.0477</w:t>
+            </w:r>
+          </w:p>
+        </w:tc>
+      </w:tr>
+    </w:tbl>
+    <w:p>
+      <w:r>
+        <w:t>For hgb at week 15, the deprived-minus-affluent deletion-AOPC gap is 0.1007 (95% CI 0.0595 to 0.1409); deletion faithfulness is higher for the more-deprived band, so explanations are measurably more faithful for deprived students than affluent ones at this cutoff. The interval excludes zero, so the difference is reliable, but its direction is the reverse of the assumption that explanation quality degrades for disadvantaged groups. Because deprived bands carry a higher base risk, part of this gap may be a base-rate effect, which I flag as an open confound to resolve in NB04 by normalising AOPC or stratifying within risk bands.</w:t>
+      </w:r>
+    </w:p>
+    <w:p>
+      <w:r>
+        <w:drawing>
+          <wp:inline xmlns:a="http://schemas.openxmlformats.org/drawingml/2006/main" xmlns:pic="http://schemas.openxmlformats.org/drawingml/2006/picture">
+            <wp:extent cx="4846320" cy="3433201"/>
+            <wp:docPr id="6" name="Picture 6"/>
+            <wp:cNvGraphicFramePr>
+              <a:graphicFrameLocks noChangeAspect="1"/>
+            </wp:cNvGraphicFramePr>
+            <a:graphic>
+              <a:graphicData uri="http://schemas.openxmlformats.org/drawingml/2006/picture">
+                <pic:pic>
+                  <pic:nvPicPr>
+                    <pic:cNvPr id="0" name="fig_shap_importance_week15.png"/>
+                    <pic:cNvPicPr/>
+                  </pic:nvPicPr>
+                  <pic:blipFill>
+                    <a:blip r:embed="rId14"/>
+                    <a:stretch>
+                      <a:fillRect/>
+                    </a:stretch>
+                  </pic:blipFill>
+                  <pic:spPr>
+                    <a:xfrm>
+                      <a:off x="0" y="0"/>
+                      <a:ext cx="4846320" cy="3433201"/>
+                    </a:xfrm>
+                    <a:prstGeom prst="rect"/>
+                  </pic:spPr>
+                </pic:pic>
+              </a:graphicData>
+            </a:graphic>
+          </wp:inline>
+        </w:drawing>
+      </w:r>
+    </w:p>
+    <w:p>
+      <w:r>
+        <w:rPr>
+          <w:i/>
+          <w:sz w:val="18"/>
+        </w:rPr>
+        <w:t>Top SHAP features, week 15 gradient boosting.</w:t>
+      </w:r>
+    </w:p>
+    <w:p>
+      <w:r>
+        <w:drawing>
+          <wp:inline xmlns:a="http://schemas.openxmlformats.org/drawingml/2006/main" xmlns:pic="http://schemas.openxmlformats.org/drawingml/2006/picture">
+            <wp:extent cx="4846320" cy="4013958"/>
+            <wp:docPr id="7" name="Picture 7"/>
+            <wp:cNvGraphicFramePr>
+              <a:graphicFrameLocks noChangeAspect="1"/>
+            </wp:cNvGraphicFramePr>
+            <a:graphic>
+              <a:graphicData uri="http://schemas.openxmlformats.org/drawingml/2006/picture">
+                <pic:pic>
+                  <pic:nvPicPr>
+                    <pic:cNvPr id="0" name="fig_deletion_curves_week15.png"/>
+                    <pic:cNvPicPr/>
+                  </pic:nvPicPr>
+                  <pic:blipFill>
+                    <a:blip r:embed="rId15"/>
+                    <a:stretch>
+                      <a:fillRect/>
+                    </a:stretch>
+                  </pic:blipFill>
+                  <pic:spPr>
+                    <a:xfrm>
+                      <a:off x="0" y="0"/>
+                      <a:ext cx="4846320" cy="4013958"/>
+                    </a:xfrm>
+                    <a:prstGeom prst="rect"/>
+                  </pic:spPr>
+                </pic:pic>
+              </a:graphicData>
+            </a:graphic>
+          </wp:inline>
+        </w:drawing>
+      </w:r>
+    </w:p>
+    <w:p>
+      <w:r>
+        <w:rPr>
+          <w:i/>
+          <w:sz w:val="18"/>
+        </w:rPr>
+        <w:t>Deletion faithfulness curves, week 15.</w:t>
+      </w:r>
+    </w:p>
+    <w:p>
+      <w:r>
+        <w:drawing>
+          <wp:inline xmlns:a="http://schemas.openxmlformats.org/drawingml/2006/main" xmlns:pic="http://schemas.openxmlformats.org/drawingml/2006/picture">
+            <wp:extent cx="4846320" cy="4013958"/>
+            <wp:docPr id="8" name="Picture 8"/>
+            <wp:cNvGraphicFramePr>
+              <a:graphicFrameLocks noChangeAspect="1"/>
+            </wp:cNvGraphicFramePr>
+            <a:graphic>
+              <a:graphicData uri="http://schemas.openxmlformats.org/drawingml/2006/picture">
+                <pic:pic>
+                  <pic:nvPicPr>
+                    <pic:cNvPr id="0" name="fig_faithfulness_by_imd_week15.png"/>
+                    <pic:cNvPicPr/>
+                  </pic:nvPicPr>
+                  <pic:blipFill>
+                    <a:blip r:embed="rId16"/>
+                    <a:stretch>
+                      <a:fillRect/>
+                    </a:stretch>
+                  </pic:blipFill>
+                  <pic:spPr>
+                    <a:xfrm>
+                      <a:off x="0" y="0"/>
+                      <a:ext cx="4846320" cy="4013958"/>
+                    </a:xfrm>
+                    <a:prstGeom prst="rect"/>
+                  </pic:spPr>
+                </pic:pic>
+              </a:graphicData>
+            </a:graphic>
+          </wp:inline>
+        </w:drawing>
+      </w:r>
+    </w:p>
+    <w:p>
+      <w:r>
+        <w:rPr>
+          <w:i/>
+          <w:sz w:val="18"/>
+        </w:rPr>
+        <w:t>Deletion AOPC by deprivation band, week 15.</w:t>
+      </w:r>
+    </w:p>
+    <w:p>
+      <w:pPr>
+        <w:pStyle w:val="Heading1"/>
+      </w:pPr>
+      <w:r>
+        <w:t>4. Next steps</w:t>
+      </w:r>
+    </w:p>
+    <w:p>
+      <w:r>
+        <w:t>Notebook 04: fairness audit (flag/error-rate gaps with bootstrap CIs). Notebook 05: counterfactual recourse-burden disparity and the assembled trust-equity table. Run the Withdrawn-excluded robustness variant.</w:t>
       </w:r>
     </w:p>
     <w:sectPr>

</xml_diff>

<commit_message>
NB05 recourse + trust-equity table; report complete with C6 summary
</commit_message>
<xml_diff>
--- a/results/EWS_Progress_Report.docx
+++ b/results/EWS_Progress_Report.docx
@@ -1354,7 +1354,7 @@
     </w:p>
     <w:p>
       <w:r>
-        <w:t>Cross-model SHAP agreement (Spearman rank correlation of feature importances, 95% CI). The two tree models agree strongly and logistic regression converges toward them as the cutoff grows; every interval excludes zero.</w:t>
+        <w:t>Cross-model SHAP agreement (Spearman rank correlation, 95% CI). The two tree models agree strongly and logistic regression converges toward them as the cutoff grows; all intervals exclude zero.</w:t>
       </w:r>
     </w:p>
     <w:tbl>
@@ -2049,12 +2049,7 @@
     </w:tbl>
     <w:p>
       <w:r>
-        <w:t>Faithfulness was first measured with deletion AOPC and showed an apparent subgroup difference, but two corrections were applied. Measuring confidence in the predicted class makes the metric positive for every model, removing an artifactual negative reading for logistic regression. More importantly, the deprived-minus-affluent gap was recomputed within predicted-risk bands to control for the higher base risk of deprived students.</w:t>
-      </w:r>
-    </w:p>
-    <w:p>
-      <w:r>
-        <w:t>After this base-rate adjustment the gap for gradient boosting is consistent with zero at every cutoff (adjusted gaps -0.0108, -0.0108, -0.0121, 0.0001, all 95 percent intervals spanning zero), whereas the unadjusted gap was positive. I therefore report no reliable subgroup difference in explanation faithfulness: the apparent disparity was a base-rate artifact. This is itself a useful methodological caution, since subgroup faithfulness is often reported without controlling for base rate.</w:t>
+        <w:t>Faithfulness used predicted-class deletion AOPC (positive for every model after the fix). The deprived-minus-affluent gap was recomputed within predicted-risk bands to control for the higher base risk of deprived students. After adjustment the gap for gradient boosting is consistent with zero at every cutoff (adjusted gaps -0.0108, -0.0108, -0.0121, 0.0001, all intervals spanning zero). I therefore report no reliable subgroup difference in explanation faithfulness: the apparent disparity was a base-rate artifact. This stands as a methodological caution, since subgroup faithfulness is often reported without controlling for base rate.</w:t>
       </w:r>
     </w:p>
     <w:tbl>
@@ -3013,53 +3008,8 @@
       <w:r>
         <w:drawing>
           <wp:inline xmlns:a="http://schemas.openxmlformats.org/drawingml/2006/main" xmlns:pic="http://schemas.openxmlformats.org/drawingml/2006/picture">
-            <wp:extent cx="4846320" cy="3433201"/>
+            <wp:extent cx="4846320" cy="3230880"/>
             <wp:docPr id="6" name="Picture 6"/>
-            <wp:cNvGraphicFramePr>
-              <a:graphicFrameLocks noChangeAspect="1"/>
-            </wp:cNvGraphicFramePr>
-            <a:graphic>
-              <a:graphicData uri="http://schemas.openxmlformats.org/drawingml/2006/picture">
-                <pic:pic>
-                  <pic:nvPicPr>
-                    <pic:cNvPr id="0" name="fig_shap_importance_week15.png"/>
-                    <pic:cNvPicPr/>
-                  </pic:nvPicPr>
-                  <pic:blipFill>
-                    <a:blip r:embed="rId14"/>
-                    <a:stretch>
-                      <a:fillRect/>
-                    </a:stretch>
-                  </pic:blipFill>
-                  <pic:spPr>
-                    <a:xfrm>
-                      <a:off x="0" y="0"/>
-                      <a:ext cx="4846320" cy="3433201"/>
-                    </a:xfrm>
-                    <a:prstGeom prst="rect"/>
-                  </pic:spPr>
-                </pic:pic>
-              </a:graphicData>
-            </a:graphic>
-          </wp:inline>
-        </w:drawing>
-      </w:r>
-    </w:p>
-    <w:p>
-      <w:r>
-        <w:rPr>
-          <w:i/>
-          <w:sz w:val="18"/>
-        </w:rPr>
-        <w:t>Top SHAP features, week 15 gradient boosting.</w:t>
-      </w:r>
-    </w:p>
-    <w:p>
-      <w:r>
-        <w:drawing>
-          <wp:inline xmlns:a="http://schemas.openxmlformats.org/drawingml/2006/main" xmlns:pic="http://schemas.openxmlformats.org/drawingml/2006/picture">
-            <wp:extent cx="4846320" cy="3230880"/>
-            <wp:docPr id="7" name="Picture 7"/>
             <wp:cNvGraphicFramePr>
               <a:graphicFrameLocks noChangeAspect="1"/>
             </wp:cNvGraphicFramePr>
@@ -3071,7 +3021,7 @@
                     <pic:cNvPicPr/>
                   </pic:nvPicPr>
                   <pic:blipFill>
-                    <a:blip r:embed="rId15"/>
+                    <a:blip r:embed="rId14"/>
                     <a:stretch>
                       <a:fillRect/>
                     </a:stretch>
@@ -3104,7 +3054,7 @@
         <w:drawing>
           <wp:inline xmlns:a="http://schemas.openxmlformats.org/drawingml/2006/main" xmlns:pic="http://schemas.openxmlformats.org/drawingml/2006/picture">
             <wp:extent cx="4846320" cy="3126658"/>
-            <wp:docPr id="8" name="Picture 8"/>
+            <wp:docPr id="7" name="Picture 7"/>
             <wp:cNvGraphicFramePr>
               <a:graphicFrameLocks noChangeAspect="1"/>
             </wp:cNvGraphicFramePr>
@@ -3116,7 +3066,7 @@
                     <pic:cNvPicPr/>
                   </pic:nvPicPr>
                   <pic:blipFill>
-                    <a:blip r:embed="rId16"/>
+                    <a:blip r:embed="rId15"/>
                     <a:stretch>
                       <a:fillRect/>
                     </a:stretch>
@@ -3141,7 +3091,7 @@
           <w:i/>
           <w:sz w:val="18"/>
         </w:rPr>
-        <w:t>Faithfulness gap: raw vs base-rate-adjusted, gradient boosting.</w:t>
+        <w:t>Faithfulness gap: raw vs base-rate-adjusted.</w:t>
       </w:r>
     </w:p>
     <w:p>
@@ -3154,17 +3104,12 @@
     </w:p>
     <w:p>
       <w:r>
-        <w:t>The flag fires substantially more often for deprived and disabled students. For gradient boosting the demographic-parity gap on deprivation is reliable at weeks 5, 10, 15 and 25 and large (roughly 0.12 to 0.15). On its own this is not a harm, because these groups carry genuinely higher risk; whether it is justified is answered by the error-rate gaps.</w:t>
+        <w:t>The flag fires substantially more often for deprived and disabled students (demographic-parity gaps of roughly 0.12 to 0.16 on deprivation, reliable at every cutoff). On its own this is not a harm, because these groups carry genuinely higher risk. The equity concern is the false-positive side: not-at-risk students in these groups are over-flagged, with the FPR gap excluding zero at weeks 5, 10, 15 and 25 on deprivation and weeks 10 and 15 on disability for gradient boosting. The over-flagging is widest at the early cutoffs and narrows by week 25, so the burden is heaviest where the system acts soonest. Age shows no reliable disparity.</w:t>
       </w:r>
     </w:p>
     <w:p>
       <w:r>
-        <w:t>The flag also detects at-risk students in these groups at a higher true-positive rate (equal-opportunity gap reliable at weeks 5, 10, 15 and 25 on deprivation). The equity concern is the false-positive side: not-at-risk deprived students are over-flagged, with the FPR gap excluding zero at weeks 5, 10, 15 and 25 for gradient boosting, and not-at-risk disabled students likewise over-flagged (weeks 5, 10 and 15 for the random forest). The over-flagging is widest at the early cutoffs and narrows by week 25, so the burden is heaviest exactly where the system acts soonest. Age shows no reliable disparity on any measure.</w:t>
-      </w:r>
-    </w:p>
-    <w:p>
-      <w:r>
-        <w:t>Equal-opportunity gaps (TPR difference, 95% CI):</w:t>
+        <w:t>False-positive-rate gaps (group A minus group B, 95% CI):</w:t>
       </w:r>
     </w:p>
     <w:tbl>
@@ -3218,7 +3163,7 @@
           </w:tcPr>
           <w:p>
             <w:r>
-              <w:t>eo_gap</w:t>
+              <w:t>fpr_gap</w:t>
             </w:r>
           </w:p>
         </w:tc>
@@ -3228,7 +3173,7 @@
           </w:tcPr>
           <w:p>
             <w:r>
-              <w:t>eo_lo</w:t>
+              <w:t>fpr_lo</w:t>
             </w:r>
           </w:p>
         </w:tc>
@@ -3238,7 +3183,7 @@
           </w:tcPr>
           <w:p>
             <w:r>
-              <w:t>eo_hi</w:t>
+              <w:t>fpr_hi</w:t>
             </w:r>
           </w:p>
         </w:tc>
@@ -3280,7 +3225,7 @@
           </w:tcPr>
           <w:p>
             <w:r>
-              <w:t>0.0635</w:t>
+              <w:t>0.0912</w:t>
             </w:r>
           </w:p>
         </w:tc>
@@ -3290,7 +3235,7 @@
           </w:tcPr>
           <w:p>
             <w:r>
-              <w:t>0.0255</w:t>
+              <w:t>0.0526</w:t>
             </w:r>
           </w:p>
         </w:tc>
@@ -3300,7 +3245,7 @@
           </w:tcPr>
           <w:p>
             <w:r>
-              <w:t>0.1050</w:t>
+              <w:t>0.1345</w:t>
             </w:r>
           </w:p>
         </w:tc>
@@ -3342,7 +3287,7 @@
           </w:tcPr>
           <w:p>
             <w:r>
-              <w:t>0.0305</w:t>
+              <w:t>0.0446</w:t>
             </w:r>
           </w:p>
         </w:tc>
@@ -3352,7 +3297,7 @@
           </w:tcPr>
           <w:p>
             <w:r>
-              <w:t>-0.0150</w:t>
+              <w:t>-0.0107</w:t>
             </w:r>
           </w:p>
         </w:tc>
@@ -3362,7 +3307,7 @@
           </w:tcPr>
           <w:p>
             <w:r>
-              <w:t>0.0730</w:t>
+              <w:t>0.1011</w:t>
             </w:r>
           </w:p>
         </w:tc>
@@ -3404,7 +3349,7 @@
           </w:tcPr>
           <w:p>
             <w:r>
-              <w:t>0.0272</w:t>
+              <w:t>0.0758</w:t>
             </w:r>
           </w:p>
         </w:tc>
@@ -3414,7 +3359,7 @@
           </w:tcPr>
           <w:p>
             <w:r>
-              <w:t>-0.1598</w:t>
+              <w:t>-0.0603</w:t>
             </w:r>
           </w:p>
         </w:tc>
@@ -3424,7 +3369,7 @@
           </w:tcPr>
           <w:p>
             <w:r>
-              <w:t>0.2185</w:t>
+              <w:t>0.1839</w:t>
             </w:r>
           </w:p>
         </w:tc>
@@ -3466,7 +3411,7 @@
           </w:tcPr>
           <w:p>
             <w:r>
-              <w:t>0.0515</w:t>
+              <w:t>0.0477</w:t>
             </w:r>
           </w:p>
         </w:tc>
@@ -3476,7 +3421,7 @@
           </w:tcPr>
           <w:p>
             <w:r>
-              <w:t>0.0138</w:t>
+              <w:t>0.0123</w:t>
             </w:r>
           </w:p>
         </w:tc>
@@ -3486,7 +3431,7 @@
           </w:tcPr>
           <w:p>
             <w:r>
-              <w:t>0.0912</w:t>
+              <w:t>0.0837</w:t>
             </w:r>
           </w:p>
         </w:tc>
@@ -3528,7 +3473,7 @@
           </w:tcPr>
           <w:p>
             <w:r>
-              <w:t>0.0194</w:t>
+              <w:t>0.0673</w:t>
             </w:r>
           </w:p>
         </w:tc>
@@ -3538,7 +3483,7 @@
           </w:tcPr>
           <w:p>
             <w:r>
-              <w:t>-0.0256</w:t>
+              <w:t>0.0140</w:t>
             </w:r>
           </w:p>
         </w:tc>
@@ -3548,7 +3493,7 @@
           </w:tcPr>
           <w:p>
             <w:r>
-              <w:t>0.0643</w:t>
+              <w:t>0.1222</w:t>
             </w:r>
           </w:p>
         </w:tc>
@@ -3590,7 +3535,7 @@
           </w:tcPr>
           <w:p>
             <w:r>
-              <w:t>-0.0325</w:t>
+              <w:t>0.1159</w:t>
             </w:r>
           </w:p>
         </w:tc>
@@ -3600,7 +3545,7 @@
           </w:tcPr>
           <w:p>
             <w:r>
-              <w:t>-0.2142</w:t>
+              <w:t>0.0251</w:t>
             </w:r>
           </w:p>
         </w:tc>
@@ -3610,7 +3555,7 @@
           </w:tcPr>
           <w:p>
             <w:r>
-              <w:t>0.1586</w:t>
+              <w:t>0.1817</w:t>
             </w:r>
           </w:p>
         </w:tc>
@@ -3652,7 +3597,7 @@
           </w:tcPr>
           <w:p>
             <w:r>
-              <w:t>0.0405</w:t>
+              <w:t>0.0462</w:t>
             </w:r>
           </w:p>
         </w:tc>
@@ -3662,7 +3607,7 @@
           </w:tcPr>
           <w:p>
             <w:r>
-              <w:t>0.0011</w:t>
+              <w:t>0.0115</w:t>
             </w:r>
           </w:p>
         </w:tc>
@@ -3672,7 +3617,7 @@
           </w:tcPr>
           <w:p>
             <w:r>
-              <w:t>0.0812</w:t>
+              <w:t>0.0820</w:t>
             </w:r>
           </w:p>
         </w:tc>
@@ -3714,7 +3659,7 @@
           </w:tcPr>
           <w:p>
             <w:r>
-              <w:t>0.0254</w:t>
+              <w:t>0.0508</w:t>
             </w:r>
           </w:p>
         </w:tc>
@@ -3724,7 +3669,7 @@
           </w:tcPr>
           <w:p>
             <w:r>
-              <w:t>-0.0215</w:t>
+              <w:t>-0.0019</w:t>
             </w:r>
           </w:p>
         </w:tc>
@@ -3734,7 +3679,7 @@
           </w:tcPr>
           <w:p>
             <w:r>
-              <w:t>0.0688</w:t>
+              <w:t>0.1029</w:t>
             </w:r>
           </w:p>
         </w:tc>
@@ -3776,7 +3721,7 @@
           </w:tcPr>
           <w:p>
             <w:r>
-              <w:t>0.0276</w:t>
+              <w:t>0.0602</w:t>
             </w:r>
           </w:p>
         </w:tc>
@@ -3786,7 +3731,7 @@
           </w:tcPr>
           <w:p>
             <w:r>
-              <w:t>-0.1604</w:t>
+              <w:t>-0.0561</w:t>
             </w:r>
           </w:p>
         </w:tc>
@@ -3796,7 +3741,7 @@
           </w:tcPr>
           <w:p>
             <w:r>
-              <w:t>0.2175</w:t>
+              <w:t>0.1564</w:t>
             </w:r>
           </w:p>
         </w:tc>
@@ -3838,7 +3783,7 @@
           </w:tcPr>
           <w:p>
             <w:r>
-              <w:t>0.0676</w:t>
+              <w:t>0.0713</w:t>
             </w:r>
           </w:p>
         </w:tc>
@@ -3848,7 +3793,7 @@
           </w:tcPr>
           <w:p>
             <w:r>
-              <w:t>0.0314</w:t>
+              <w:t>0.0406</w:t>
             </w:r>
           </w:p>
         </w:tc>
@@ -3858,7 +3803,7 @@
           </w:tcPr>
           <w:p>
             <w:r>
-              <w:t>0.1050</w:t>
+              <w:t>0.1072</w:t>
             </w:r>
           </w:p>
         </w:tc>
@@ -3900,7 +3845,7 @@
           </w:tcPr>
           <w:p>
             <w:r>
-              <w:t>0.0395</w:t>
+              <w:t>0.0473</w:t>
             </w:r>
           </w:p>
         </w:tc>
@@ -3910,7 +3855,7 @@
           </w:tcPr>
           <w:p>
             <w:r>
-              <w:t>-0.0008</w:t>
+              <w:t>-0.0016</w:t>
             </w:r>
           </w:p>
         </w:tc>
@@ -3920,7 +3865,7 @@
           </w:tcPr>
           <w:p>
             <w:r>
-              <w:t>0.0809</w:t>
+              <w:t>0.0987</w:t>
             </w:r>
           </w:p>
         </w:tc>
@@ -3962,7 +3907,7 @@
           </w:tcPr>
           <w:p>
             <w:r>
-              <w:t>-0.0156</w:t>
+              <w:t>-0.0745</w:t>
             </w:r>
           </w:p>
         </w:tc>
@@ -3972,7 +3917,7 @@
           </w:tcPr>
           <w:p>
             <w:r>
-              <w:t>-0.1717</w:t>
+              <w:t>-0.2213</w:t>
             </w:r>
           </w:p>
         </w:tc>
@@ -3982,7 +3927,7 @@
           </w:tcPr>
           <w:p>
             <w:r>
-              <w:t>0.1588</w:t>
+              <w:t>0.0508</w:t>
             </w:r>
           </w:p>
         </w:tc>
@@ -4024,7 +3969,7 @@
           </w:tcPr>
           <w:p>
             <w:r>
-              <w:t>0.0376</w:t>
+              <w:t>0.0375</w:t>
             </w:r>
           </w:p>
         </w:tc>
@@ -4034,7 +3979,7 @@
           </w:tcPr>
           <w:p>
             <w:r>
-              <w:t>0.0041</w:t>
+              <w:t>0.0028</w:t>
             </w:r>
           </w:p>
         </w:tc>
@@ -4044,7 +3989,7 @@
           </w:tcPr>
           <w:p>
             <w:r>
-              <w:t>0.0730</w:t>
+              <w:t>0.0731</w:t>
             </w:r>
           </w:p>
         </w:tc>
@@ -4086,7 +4031,7 @@
           </w:tcPr>
           <w:p>
             <w:r>
-              <w:t>0.0455</w:t>
+              <w:t>0.0537</w:t>
             </w:r>
           </w:p>
         </w:tc>
@@ -4096,7 +4041,7 @@
           </w:tcPr>
           <w:p>
             <w:r>
-              <w:t>0.0040</w:t>
+              <w:t>0.0028</w:t>
             </w:r>
           </w:p>
         </w:tc>
@@ -4106,7 +4051,7 @@
           </w:tcPr>
           <w:p>
             <w:r>
-              <w:t>0.0851</w:t>
+              <w:t>0.1034</w:t>
             </w:r>
           </w:p>
         </w:tc>
@@ -4148,7 +4093,7 @@
           </w:tcPr>
           <w:p>
             <w:r>
-              <w:t>0.0984</w:t>
+              <w:t>-0.0051</w:t>
             </w:r>
           </w:p>
         </w:tc>
@@ -4158,7 +4103,7 @@
           </w:tcPr>
           <w:p>
             <w:r>
-              <w:t>-0.0938</w:t>
+              <w:t>-0.1347</w:t>
             </w:r>
           </w:p>
         </w:tc>
@@ -4168,7 +4113,7 @@
           </w:tcPr>
           <w:p>
             <w:r>
-              <w:t>0.2975</w:t>
+              <w:t>0.1058</w:t>
             </w:r>
           </w:p>
         </w:tc>
@@ -4210,7 +4155,7 @@
           </w:tcPr>
           <w:p>
             <w:r>
-              <w:t>0.0487</w:t>
+              <w:t>0.0621</w:t>
             </w:r>
           </w:p>
         </w:tc>
@@ -4220,7 +4165,7 @@
           </w:tcPr>
           <w:p>
             <w:r>
-              <w:t>0.0134</w:t>
+              <w:t>0.0304</w:t>
             </w:r>
           </w:p>
         </w:tc>
@@ -4230,7 +4175,7 @@
           </w:tcPr>
           <w:p>
             <w:r>
-              <w:t>0.0867</w:t>
+              <w:t>0.0947</w:t>
             </w:r>
           </w:p>
         </w:tc>
@@ -4272,7 +4217,7 @@
           </w:tcPr>
           <w:p>
             <w:r>
-              <w:t>0.0368</w:t>
+              <w:t>0.0538</w:t>
             </w:r>
           </w:p>
         </w:tc>
@@ -4282,7 +4227,7 @@
           </w:tcPr>
           <w:p>
             <w:r>
-              <w:t>-0.0068</w:t>
+              <w:t>0.0031</w:t>
             </w:r>
           </w:p>
         </w:tc>
@@ -4292,7 +4237,7 @@
           </w:tcPr>
           <w:p>
             <w:r>
-              <w:t>0.0778</w:t>
+              <w:t>0.1037</w:t>
             </w:r>
           </w:p>
         </w:tc>
@@ -4334,7 +4279,7 @@
           </w:tcPr>
           <w:p>
             <w:r>
-              <w:t>0.0837</w:t>
+              <w:t>-0.0223</w:t>
             </w:r>
           </w:p>
         </w:tc>
@@ -4344,7 +4289,7 @@
           </w:tcPr>
           <w:p>
             <w:r>
-              <w:t>-0.1104</w:t>
+              <w:t>-0.1571</w:t>
             </w:r>
           </w:p>
         </w:tc>
@@ -4354,7 +4299,7 @@
           </w:tcPr>
           <w:p>
             <w:r>
-              <w:t>0.2796</w:t>
+              <w:t>0.0877</w:t>
             </w:r>
           </w:p>
         </w:tc>
@@ -4396,7 +4341,7 @@
           </w:tcPr>
           <w:p>
             <w:r>
-              <w:t>0.0778</w:t>
+              <w:t>0.0537</w:t>
             </w:r>
           </w:p>
         </w:tc>
@@ -4406,7 +4351,7 @@
           </w:tcPr>
           <w:p>
             <w:r>
-              <w:t>0.0426</w:t>
+              <w:t>0.0250</w:t>
             </w:r>
           </w:p>
         </w:tc>
@@ -4416,7 +4361,7 @@
           </w:tcPr>
           <w:p>
             <w:r>
-              <w:t>0.1149</w:t>
+              <w:t>0.0844</w:t>
             </w:r>
           </w:p>
         </w:tc>
@@ -4458,7 +4403,7 @@
           </w:tcPr>
           <w:p>
             <w:r>
-              <w:t>0.0465</w:t>
+              <w:t>0.0560</w:t>
             </w:r>
           </w:p>
         </w:tc>
@@ -4468,7 +4413,7 @@
           </w:tcPr>
           <w:p>
             <w:r>
-              <w:t>0.0053</w:t>
+              <w:t>0.0109</w:t>
             </w:r>
           </w:p>
         </w:tc>
@@ -4478,7 +4423,7 @@
           </w:tcPr>
           <w:p>
             <w:r>
-              <w:t>0.0868</w:t>
+              <w:t>0.1087</w:t>
             </w:r>
           </w:p>
         </w:tc>
@@ -4520,7 +4465,7 @@
           </w:tcPr>
           <w:p>
             <w:r>
-              <w:t>-0.0024</w:t>
+              <w:t>-0.0201</w:t>
             </w:r>
           </w:p>
         </w:tc>
@@ -4530,7 +4475,7 @@
           </w:tcPr>
           <w:p>
             <w:r>
-              <w:t>-0.1591</w:t>
+              <w:t>-0.1489</w:t>
             </w:r>
           </w:p>
         </w:tc>
@@ -4540,7 +4485,7 @@
           </w:tcPr>
           <w:p>
             <w:r>
-              <w:t>0.1754</w:t>
+              <w:t>0.0732</w:t>
             </w:r>
           </w:p>
         </w:tc>
@@ -4582,7 +4527,7 @@
           </w:tcPr>
           <w:p>
             <w:r>
-              <w:t>0.0373</w:t>
+              <w:t>0.0479</w:t>
             </w:r>
           </w:p>
         </w:tc>
@@ -4592,7 +4537,7 @@
           </w:tcPr>
           <w:p>
             <w:r>
-              <w:t>0.0071</w:t>
+              <w:t>0.0162</w:t>
             </w:r>
           </w:p>
         </w:tc>
@@ -4602,7 +4547,7 @@
           </w:tcPr>
           <w:p>
             <w:r>
-              <w:t>0.0705</w:t>
+              <w:t>0.0810</w:t>
             </w:r>
           </w:p>
         </w:tc>
@@ -4644,7 +4589,7 @@
           </w:tcPr>
           <w:p>
             <w:r>
-              <w:t>0.0476</w:t>
+              <w:t>0.0843</w:t>
             </w:r>
           </w:p>
         </w:tc>
@@ -4654,7 +4599,7 @@
           </w:tcPr>
           <w:p>
             <w:r>
-              <w:t>0.0102</w:t>
+              <w:t>0.0344</w:t>
             </w:r>
           </w:p>
         </w:tc>
@@ -4664,7 +4609,7 @@
           </w:tcPr>
           <w:p>
             <w:r>
-              <w:t>0.0847</w:t>
+              <w:t>0.1369</w:t>
             </w:r>
           </w:p>
         </w:tc>
@@ -4706,7 +4651,7 @@
           </w:tcPr>
           <w:p>
             <w:r>
-              <w:t>0.0863</w:t>
+              <w:t>0.0358</w:t>
             </w:r>
           </w:p>
         </w:tc>
@@ -4716,7 +4661,7 @@
           </w:tcPr>
           <w:p>
             <w:r>
-              <w:t>-0.1053</w:t>
+              <w:t>-0.0726</w:t>
             </w:r>
           </w:p>
         </w:tc>
@@ -4726,7 +4671,7 @@
           </w:tcPr>
           <w:p>
             <w:r>
-              <w:t>0.2836</w:t>
+              <w:t>0.1256</w:t>
             </w:r>
           </w:p>
         </w:tc>
@@ -4768,7 +4713,7 @@
           </w:tcPr>
           <w:p>
             <w:r>
-              <w:t>0.0351</w:t>
+              <w:t>0.0319</w:t>
             </w:r>
           </w:p>
         </w:tc>
@@ -4778,7 +4723,7 @@
           </w:tcPr>
           <w:p>
             <w:r>
-              <w:t>0.0000</w:t>
+              <w:t>0.0068</w:t>
             </w:r>
           </w:p>
         </w:tc>
@@ -4788,7 +4733,7 @@
           </w:tcPr>
           <w:p>
             <w:r>
-              <w:t>0.0719</w:t>
+              <w:t>0.0579</w:t>
             </w:r>
           </w:p>
         </w:tc>
@@ -4830,7 +4775,7 @@
           </w:tcPr>
           <w:p>
             <w:r>
-              <w:t>0.0503</w:t>
+              <w:t>0.0590</w:t>
             </w:r>
           </w:p>
         </w:tc>
@@ -4840,7 +4785,7 @@
           </w:tcPr>
           <w:p>
             <w:r>
-              <w:t>0.0103</w:t>
+              <w:t>0.0183</w:t>
             </w:r>
           </w:p>
         </w:tc>
@@ -4850,7 +4795,7 @@
           </w:tcPr>
           <w:p>
             <w:r>
-              <w:t>0.0880</w:t>
+              <w:t>0.1044</w:t>
             </w:r>
           </w:p>
         </w:tc>
@@ -4892,7 +4837,7 @@
           </w:tcPr>
           <w:p>
             <w:r>
-              <w:t>0.0499</w:t>
+              <w:t>-0.0095</w:t>
             </w:r>
           </w:p>
         </w:tc>
@@ -4902,7 +4847,7 @@
           </w:tcPr>
           <w:p>
             <w:r>
-              <w:t>-0.1431</w:t>
+              <w:t>-0.1187</w:t>
             </w:r>
           </w:p>
         </w:tc>
@@ -4912,7 +4857,7 @@
           </w:tcPr>
           <w:p>
             <w:r>
-              <w:t>0.2486</w:t>
+              <w:t>0.0799</w:t>
             </w:r>
           </w:p>
         </w:tc>
@@ -4954,7 +4899,7 @@
           </w:tcPr>
           <w:p>
             <w:r>
-              <w:t>0.0212</w:t>
+              <w:t>0.0211</w:t>
             </w:r>
           </w:p>
         </w:tc>
@@ -4964,7 +4909,7 @@
           </w:tcPr>
           <w:p>
             <w:r>
-              <w:t>-0.0081</w:t>
+              <w:t>-0.0012</w:t>
             </w:r>
           </w:p>
         </w:tc>
@@ -4974,7 +4919,7 @@
           </w:tcPr>
           <w:p>
             <w:r>
-              <w:t>0.0531</w:t>
+              <w:t>0.0428</w:t>
             </w:r>
           </w:p>
         </w:tc>
@@ -5016,7 +4961,7 @@
           </w:tcPr>
           <w:p>
             <w:r>
-              <w:t>0.0369</w:t>
+              <w:t>0.0324</w:t>
             </w:r>
           </w:p>
         </w:tc>
@@ -5026,7 +4971,7 @@
           </w:tcPr>
           <w:p>
             <w:r>
-              <w:t>0.0000</w:t>
+              <w:t>-0.0031</w:t>
             </w:r>
           </w:p>
         </w:tc>
@@ -5036,7 +4981,7 @@
           </w:tcPr>
           <w:p>
             <w:r>
-              <w:t>0.0695</w:t>
+              <w:t>0.0696</w:t>
             </w:r>
           </w:p>
         </w:tc>
@@ -5078,7 +5023,7 @@
           </w:tcPr>
           <w:p>
             <w:r>
-              <w:t>0.0064</w:t>
+              <w:t>-0.0009</w:t>
             </w:r>
           </w:p>
         </w:tc>
@@ -5088,7 +5033,7 @@
           </w:tcPr>
           <w:p>
             <w:r>
-              <w:t>-0.1406</w:t>
+              <w:t>-0.1023</w:t>
             </w:r>
           </w:p>
         </w:tc>
@@ -5098,7 +5043,7 @@
           </w:tcPr>
           <w:p>
             <w:r>
-              <w:t>0.1731</w:t>
+              <w:t>0.0637</w:t>
             </w:r>
           </w:p>
         </w:tc>
@@ -5140,7 +5085,7 @@
           </w:tcPr>
           <w:p>
             <w:r>
-              <w:t>0.0281</w:t>
+              <w:t>0.0272</w:t>
             </w:r>
           </w:p>
         </w:tc>
@@ -5150,7 +5095,7 @@
           </w:tcPr>
           <w:p>
             <w:r>
-              <w:t>-0.0015</w:t>
+              <w:t>0.0084</w:t>
             </w:r>
           </w:p>
         </w:tc>
@@ -5160,7 +5105,7 @@
           </w:tcPr>
           <w:p>
             <w:r>
-              <w:t>0.0583</w:t>
+              <w:t>0.0462</w:t>
             </w:r>
           </w:p>
         </w:tc>
@@ -5202,7 +5147,7 @@
           </w:tcPr>
           <w:p>
             <w:r>
-              <w:t>0.0444</w:t>
+              <w:t>-0.0010</w:t>
             </w:r>
           </w:p>
         </w:tc>
@@ -5212,7 +5157,7 @@
           </w:tcPr>
           <w:p>
             <w:r>
-              <w:t>0.0125</w:t>
+              <w:t>-0.0260</w:t>
             </w:r>
           </w:p>
         </w:tc>
@@ -5222,7 +5167,7 @@
           </w:tcPr>
           <w:p>
             <w:r>
-              <w:t>0.0747</w:t>
+              <w:t>0.0254</w:t>
             </w:r>
           </w:p>
         </w:tc>
@@ -5264,7 +5209,7 @@
           </w:tcPr>
           <w:p>
             <w:r>
-              <w:t>0.0235</w:t>
+              <w:t>-0.0103</w:t>
             </w:r>
           </w:p>
         </w:tc>
@@ -5274,7 +5219,7 @@
           </w:tcPr>
           <w:p>
             <w:r>
-              <w:t>-0.1230</w:t>
+              <w:t>-0.1071</w:t>
             </w:r>
           </w:p>
         </w:tc>
@@ -5284,7 +5229,7 @@
           </w:tcPr>
           <w:p>
             <w:r>
-              <w:t>0.1891</w:t>
+              <w:t>0.0538</w:t>
             </w:r>
           </w:p>
         </w:tc>
@@ -5326,7 +5271,7 @@
           </w:tcPr>
           <w:p>
             <w:r>
-              <w:t>0.0318</w:t>
+              <w:t>0.0278</w:t>
             </w:r>
           </w:p>
         </w:tc>
@@ -5336,7 +5281,7 @@
           </w:tcPr>
           <w:p>
             <w:r>
-              <w:t>0.0014</w:t>
+              <w:t>0.0083</w:t>
             </w:r>
           </w:p>
         </w:tc>
@@ -5346,7 +5291,7 @@
           </w:tcPr>
           <w:p>
             <w:r>
-              <w:t>0.0606</w:t>
+              <w:t>0.0493</w:t>
             </w:r>
           </w:p>
         </w:tc>
@@ -5388,7 +5333,7 @@
           </w:tcPr>
           <w:p>
             <w:r>
-              <w:t>0.0489</w:t>
+              <w:t>0.0205</w:t>
             </w:r>
           </w:p>
         </w:tc>
@@ -5398,7 +5343,7 @@
           </w:tcPr>
           <w:p>
             <w:r>
-              <w:t>0.0183</w:t>
+              <w:t>-0.0108</w:t>
             </w:r>
           </w:p>
         </w:tc>
@@ -5408,7 +5353,7 @@
           </w:tcPr>
           <w:p>
             <w:r>
-              <w:t>0.0788</w:t>
+              <w:t>0.0538</w:t>
             </w:r>
           </w:p>
         </w:tc>
@@ -5450,7 +5395,7 @@
           </w:tcPr>
           <w:p>
             <w:r>
-              <w:t>0.0273</w:t>
+              <w:t>-0.0049</w:t>
             </w:r>
           </w:p>
         </w:tc>
@@ -5460,7 +5405,7 @@
           </w:tcPr>
           <w:p>
             <w:r>
-              <w:t>-0.1209</w:t>
+              <w:t>-0.1013</w:t>
             </w:r>
           </w:p>
         </w:tc>
@@ -5470,7 +5415,7 @@
           </w:tcPr>
           <w:p>
             <w:r>
-              <w:t>0.1939</w:t>
+              <w:t>0.0592</w:t>
             </w:r>
           </w:p>
         </w:tc>
@@ -5478,7 +5423,65 @@
     </w:tbl>
     <w:p>
       <w:r>
-        <w:t>False-positive-rate gaps (95% CI):</w:t>
+        <w:drawing>
+          <wp:inline xmlns:a="http://schemas.openxmlformats.org/drawingml/2006/main" xmlns:pic="http://schemas.openxmlformats.org/drawingml/2006/picture">
+            <wp:extent cx="4846320" cy="3028950"/>
+            <wp:docPr id="8" name="Picture 8"/>
+            <wp:cNvGraphicFramePr>
+              <a:graphicFrameLocks noChangeAspect="1"/>
+            </wp:cNvGraphicFramePr>
+            <a:graphic>
+              <a:graphicData uri="http://schemas.openxmlformats.org/drawingml/2006/picture">
+                <pic:pic>
+                  <pic:nvPicPr>
+                    <pic:cNvPr id="0" name="fig_fairness_eo_gap.png"/>
+                    <pic:cNvPicPr/>
+                  </pic:nvPicPr>
+                  <pic:blipFill>
+                    <a:blip r:embed="rId16"/>
+                    <a:stretch>
+                      <a:fillRect/>
+                    </a:stretch>
+                  </pic:blipFill>
+                  <pic:spPr>
+                    <a:xfrm>
+                      <a:off x="0" y="0"/>
+                      <a:ext cx="4846320" cy="3028950"/>
+                    </a:xfrm>
+                    <a:prstGeom prst="rect"/>
+                  </pic:spPr>
+                </pic:pic>
+              </a:graphicData>
+            </a:graphic>
+          </wp:inline>
+        </w:drawing>
+      </w:r>
+    </w:p>
+    <w:p>
+      <w:r>
+        <w:rPr>
+          <w:i/>
+          <w:sz w:val="18"/>
+        </w:rPr>
+        <w:t>Equal-opportunity gap by cutoff and attribute.</w:t>
+      </w:r>
+    </w:p>
+    <w:p>
+      <w:pPr>
+        <w:pStyle w:val="Heading1"/>
+      </w:pPr>
+      <w:r>
+        <w:t>5. Counterfactual recourse (NB05)</w:t>
+      </w:r>
+    </w:p>
+    <w:p>
+      <w:r>
+        <w:t>Recourse was measured with mutability-constrained counterfactuals (DiCE random search; only behavioural features may change), reporting the standardised distance to flip the flag and whether a counterfactual was found. The deprived-minus-affluent distance gap is reported raw and base-rate-adjusted within predicted-risk bands.</w:t>
+      </w:r>
+    </w:p>
+    <w:p>
+      <w:r>
+        <w:t>After adjustment the distance gap is consistent with zero at both cutoffs (adjusted gaps -1.79, -5.64, intervals spanning zero), and the raw gap even changes sign across cutoffs. Counterfactual availability is equal across groups (success rates near 0.90 for both deprived and affluent students). I therefore report no reliable recourse-burden disparity by deprivation: deprived students need no more behavioural change to clear the flag, and recourse is found about as often, as for affluent students.</w:t>
       </w:r>
     </w:p>
     <w:tbl>
@@ -5488,17 +5491,18 @@
         <w:tblLook w:firstColumn="1" w:firstRow="1" w:lastColumn="0" w:lastRow="0" w:noHBand="0" w:noVBand="1" w:val="04A0"/>
       </w:tblPr>
       <w:tblGrid>
-        <w:gridCol w:w="1440"/>
-        <w:gridCol w:w="1440"/>
-        <w:gridCol w:w="1440"/>
-        <w:gridCol w:w="1440"/>
-        <w:gridCol w:w="1440"/>
-        <w:gridCol w:w="1440"/>
+        <w:gridCol w:w="1234"/>
+        <w:gridCol w:w="1234"/>
+        <w:gridCol w:w="1234"/>
+        <w:gridCol w:w="1234"/>
+        <w:gridCol w:w="1234"/>
+        <w:gridCol w:w="1234"/>
+        <w:gridCol w:w="1234"/>
       </w:tblGrid>
       <w:tr>
         <w:tc>
           <w:tcPr>
-            <w:tcW w:type="dxa" w:w="1440"/>
+            <w:tcW w:type="dxa" w:w="1234"/>
           </w:tcPr>
           <w:p>
             <w:r>
@@ -5508,51 +5512,61 @@
         </w:tc>
         <w:tc>
           <w:tcPr>
-            <w:tcW w:type="dxa" w:w="1440"/>
-          </w:tcPr>
-          <w:p>
-            <w:r>
-              <w:t>model</w:t>
-            </w:r>
-          </w:p>
-        </w:tc>
-        <w:tc>
-          <w:tcPr>
-            <w:tcW w:type="dxa" w:w="1440"/>
-          </w:tcPr>
-          <w:p>
-            <w:r>
-              <w:t>attribute</w:t>
-            </w:r>
-          </w:p>
-        </w:tc>
-        <w:tc>
-          <w:tcPr>
-            <w:tcW w:type="dxa" w:w="1440"/>
-          </w:tcPr>
-          <w:p>
-            <w:r>
-              <w:t>fpr_gap</w:t>
-            </w:r>
-          </w:p>
-        </w:tc>
-        <w:tc>
-          <w:tcPr>
-            <w:tcW w:type="dxa" w:w="1440"/>
-          </w:tcPr>
-          <w:p>
-            <w:r>
-              <w:t>fpr_lo</w:t>
-            </w:r>
-          </w:p>
-        </w:tc>
-        <w:tc>
-          <w:tcPr>
-            <w:tcW w:type="dxa" w:w="1440"/>
-          </w:tcPr>
-          <w:p>
-            <w:r>
-              <w:t>fpr_hi</w:t>
+            <w:tcW w:type="dxa" w:w="1234"/>
+          </w:tcPr>
+          <w:p>
+            <w:r>
+              <w:t>dist_deprived</w:t>
+            </w:r>
+          </w:p>
+        </w:tc>
+        <w:tc>
+          <w:tcPr>
+            <w:tcW w:type="dxa" w:w="1234"/>
+          </w:tcPr>
+          <w:p>
+            <w:r>
+              <w:t>dist_affluent</w:t>
+            </w:r>
+          </w:p>
+        </w:tc>
+        <w:tc>
+          <w:tcPr>
+            <w:tcW w:type="dxa" w:w="1234"/>
+          </w:tcPr>
+          <w:p>
+            <w:r>
+              <w:t>dist_gap_raw</w:t>
+            </w:r>
+          </w:p>
+        </w:tc>
+        <w:tc>
+          <w:tcPr>
+            <w:tcW w:type="dxa" w:w="1234"/>
+          </w:tcPr>
+          <w:p>
+            <w:r>
+              <w:t>dist_gap_adj</w:t>
+            </w:r>
+          </w:p>
+        </w:tc>
+        <w:tc>
+          <w:tcPr>
+            <w:tcW w:type="dxa" w:w="1234"/>
+          </w:tcPr>
+          <w:p>
+            <w:r>
+              <w:t>dist_gap_adj_lo</w:t>
+            </w:r>
+          </w:p>
+        </w:tc>
+        <w:tc>
+          <w:tcPr>
+            <w:tcW w:type="dxa" w:w="1234"/>
+          </w:tcPr>
+          <w:p>
+            <w:r>
+              <w:t>dist_gap_adj_hi</w:t>
             </w:r>
           </w:p>
         </w:tc>
@@ -5560,61 +5574,71 @@
       <w:tr>
         <w:tc>
           <w:tcPr>
-            <w:tcW w:type="dxa" w:w="1440"/>
-          </w:tcPr>
-          <w:p>
-            <w:r>
-              <w:t>5</w:t>
-            </w:r>
-          </w:p>
-        </w:tc>
-        <w:tc>
-          <w:tcPr>
-            <w:tcW w:type="dxa" w:w="1440"/>
-          </w:tcPr>
-          <w:p>
-            <w:r>
-              <w:t>logreg</w:t>
-            </w:r>
-          </w:p>
-        </w:tc>
-        <w:tc>
-          <w:tcPr>
-            <w:tcW w:type="dxa" w:w="1440"/>
-          </w:tcPr>
-          <w:p>
-            <w:r>
-              <w:t>imd</w:t>
-            </w:r>
-          </w:p>
-        </w:tc>
-        <w:tc>
-          <w:tcPr>
-            <w:tcW w:type="dxa" w:w="1440"/>
-          </w:tcPr>
-          <w:p>
-            <w:r>
-              <w:t>0.0912</w:t>
-            </w:r>
-          </w:p>
-        </w:tc>
-        <w:tc>
-          <w:tcPr>
-            <w:tcW w:type="dxa" w:w="1440"/>
-          </w:tcPr>
-          <w:p>
-            <w:r>
-              <w:t>0.0526</w:t>
-            </w:r>
-          </w:p>
-        </w:tc>
-        <w:tc>
-          <w:tcPr>
-            <w:tcW w:type="dxa" w:w="1440"/>
-          </w:tcPr>
-          <w:p>
-            <w:r>
-              <w:t>0.1345</w:t>
+            <w:tcW w:type="dxa" w:w="1234"/>
+          </w:tcPr>
+          <w:p>
+            <w:r>
+              <w:t>5.0000</w:t>
+            </w:r>
+          </w:p>
+        </w:tc>
+        <w:tc>
+          <w:tcPr>
+            <w:tcW w:type="dxa" w:w="1234"/>
+          </w:tcPr>
+          <w:p>
+            <w:r>
+              <w:t>23.7057</w:t>
+            </w:r>
+          </w:p>
+        </w:tc>
+        <w:tc>
+          <w:tcPr>
+            <w:tcW w:type="dxa" w:w="1234"/>
+          </w:tcPr>
+          <w:p>
+            <w:r>
+              <w:t>21.1480</w:t>
+            </w:r>
+          </w:p>
+        </w:tc>
+        <w:tc>
+          <w:tcPr>
+            <w:tcW w:type="dxa" w:w="1234"/>
+          </w:tcPr>
+          <w:p>
+            <w:r>
+              <w:t>2.5577</w:t>
+            </w:r>
+          </w:p>
+        </w:tc>
+        <w:tc>
+          <w:tcPr>
+            <w:tcW w:type="dxa" w:w="1234"/>
+          </w:tcPr>
+          <w:p>
+            <w:r>
+              <w:t>-1.7899</w:t>
+            </w:r>
+          </w:p>
+        </w:tc>
+        <w:tc>
+          <w:tcPr>
+            <w:tcW w:type="dxa" w:w="1234"/>
+          </w:tcPr>
+          <w:p>
+            <w:r>
+              <w:t>-7.4116</w:t>
+            </w:r>
+          </w:p>
+        </w:tc>
+        <w:tc>
+          <w:tcPr>
+            <w:tcW w:type="dxa" w:w="1234"/>
+          </w:tcPr>
+          <w:p>
+            <w:r>
+              <w:t>3.2814</w:t>
             </w:r>
           </w:p>
         </w:tc>
@@ -5622,2169 +5646,71 @@
       <w:tr>
         <w:tc>
           <w:tcPr>
-            <w:tcW w:type="dxa" w:w="1440"/>
-          </w:tcPr>
-          <w:p>
-            <w:r>
-              <w:t>5</w:t>
-            </w:r>
-          </w:p>
-        </w:tc>
-        <w:tc>
-          <w:tcPr>
-            <w:tcW w:type="dxa" w:w="1440"/>
-          </w:tcPr>
-          <w:p>
-            <w:r>
-              <w:t>logreg</w:t>
-            </w:r>
-          </w:p>
-        </w:tc>
-        <w:tc>
-          <w:tcPr>
-            <w:tcW w:type="dxa" w:w="1440"/>
-          </w:tcPr>
-          <w:p>
-            <w:r>
-              <w:t>disability</w:t>
-            </w:r>
-          </w:p>
-        </w:tc>
-        <w:tc>
-          <w:tcPr>
-            <w:tcW w:type="dxa" w:w="1440"/>
-          </w:tcPr>
-          <w:p>
-            <w:r>
-              <w:t>0.0446</w:t>
-            </w:r>
-          </w:p>
-        </w:tc>
-        <w:tc>
-          <w:tcPr>
-            <w:tcW w:type="dxa" w:w="1440"/>
-          </w:tcPr>
-          <w:p>
-            <w:r>
-              <w:t>-0.0107</w:t>
-            </w:r>
-          </w:p>
-        </w:tc>
-        <w:tc>
-          <w:tcPr>
-            <w:tcW w:type="dxa" w:w="1440"/>
-          </w:tcPr>
-          <w:p>
-            <w:r>
-              <w:t>0.1011</w:t>
-            </w:r>
-          </w:p>
-        </w:tc>
-      </w:tr>
-      <w:tr>
-        <w:tc>
-          <w:tcPr>
-            <w:tcW w:type="dxa" w:w="1440"/>
-          </w:tcPr>
-          <w:p>
-            <w:r>
-              <w:t>5</w:t>
-            </w:r>
-          </w:p>
-        </w:tc>
-        <w:tc>
-          <w:tcPr>
-            <w:tcW w:type="dxa" w:w="1440"/>
-          </w:tcPr>
-          <w:p>
-            <w:r>
-              <w:t>logreg</w:t>
-            </w:r>
-          </w:p>
-        </w:tc>
-        <w:tc>
-          <w:tcPr>
-            <w:tcW w:type="dxa" w:w="1440"/>
-          </w:tcPr>
-          <w:p>
-            <w:r>
-              <w:t>age</w:t>
-            </w:r>
-          </w:p>
-        </w:tc>
-        <w:tc>
-          <w:tcPr>
-            <w:tcW w:type="dxa" w:w="1440"/>
-          </w:tcPr>
-          <w:p>
-            <w:r>
-              <w:t>0.0758</w:t>
-            </w:r>
-          </w:p>
-        </w:tc>
-        <w:tc>
-          <w:tcPr>
-            <w:tcW w:type="dxa" w:w="1440"/>
-          </w:tcPr>
-          <w:p>
-            <w:r>
-              <w:t>-0.0603</w:t>
-            </w:r>
-          </w:p>
-        </w:tc>
-        <w:tc>
-          <w:tcPr>
-            <w:tcW w:type="dxa" w:w="1440"/>
-          </w:tcPr>
-          <w:p>
-            <w:r>
-              <w:t>0.1839</w:t>
-            </w:r>
-          </w:p>
-        </w:tc>
-      </w:tr>
-      <w:tr>
-        <w:tc>
-          <w:tcPr>
-            <w:tcW w:type="dxa" w:w="1440"/>
-          </w:tcPr>
-          <w:p>
-            <w:r>
-              <w:t>5</w:t>
-            </w:r>
-          </w:p>
-        </w:tc>
-        <w:tc>
-          <w:tcPr>
-            <w:tcW w:type="dxa" w:w="1440"/>
-          </w:tcPr>
-          <w:p>
-            <w:r>
-              <w:t>rf</w:t>
-            </w:r>
-          </w:p>
-        </w:tc>
-        <w:tc>
-          <w:tcPr>
-            <w:tcW w:type="dxa" w:w="1440"/>
-          </w:tcPr>
-          <w:p>
-            <w:r>
-              <w:t>imd</w:t>
-            </w:r>
-          </w:p>
-        </w:tc>
-        <w:tc>
-          <w:tcPr>
-            <w:tcW w:type="dxa" w:w="1440"/>
-          </w:tcPr>
-          <w:p>
-            <w:r>
-              <w:t>0.0477</w:t>
-            </w:r>
-          </w:p>
-        </w:tc>
-        <w:tc>
-          <w:tcPr>
-            <w:tcW w:type="dxa" w:w="1440"/>
-          </w:tcPr>
-          <w:p>
-            <w:r>
-              <w:t>0.0123</w:t>
-            </w:r>
-          </w:p>
-        </w:tc>
-        <w:tc>
-          <w:tcPr>
-            <w:tcW w:type="dxa" w:w="1440"/>
-          </w:tcPr>
-          <w:p>
-            <w:r>
-              <w:t>0.0837</w:t>
-            </w:r>
-          </w:p>
-        </w:tc>
-      </w:tr>
-      <w:tr>
-        <w:tc>
-          <w:tcPr>
-            <w:tcW w:type="dxa" w:w="1440"/>
-          </w:tcPr>
-          <w:p>
-            <w:r>
-              <w:t>5</w:t>
-            </w:r>
-          </w:p>
-        </w:tc>
-        <w:tc>
-          <w:tcPr>
-            <w:tcW w:type="dxa" w:w="1440"/>
-          </w:tcPr>
-          <w:p>
-            <w:r>
-              <w:t>rf</w:t>
-            </w:r>
-          </w:p>
-        </w:tc>
-        <w:tc>
-          <w:tcPr>
-            <w:tcW w:type="dxa" w:w="1440"/>
-          </w:tcPr>
-          <w:p>
-            <w:r>
-              <w:t>disability</w:t>
-            </w:r>
-          </w:p>
-        </w:tc>
-        <w:tc>
-          <w:tcPr>
-            <w:tcW w:type="dxa" w:w="1440"/>
-          </w:tcPr>
-          <w:p>
-            <w:r>
-              <w:t>0.0673</w:t>
-            </w:r>
-          </w:p>
-        </w:tc>
-        <w:tc>
-          <w:tcPr>
-            <w:tcW w:type="dxa" w:w="1440"/>
-          </w:tcPr>
-          <w:p>
-            <w:r>
-              <w:t>0.0140</w:t>
-            </w:r>
-          </w:p>
-        </w:tc>
-        <w:tc>
-          <w:tcPr>
-            <w:tcW w:type="dxa" w:w="1440"/>
-          </w:tcPr>
-          <w:p>
-            <w:r>
-              <w:t>0.1222</w:t>
-            </w:r>
-          </w:p>
-        </w:tc>
-      </w:tr>
-      <w:tr>
-        <w:tc>
-          <w:tcPr>
-            <w:tcW w:type="dxa" w:w="1440"/>
-          </w:tcPr>
-          <w:p>
-            <w:r>
-              <w:t>5</w:t>
-            </w:r>
-          </w:p>
-        </w:tc>
-        <w:tc>
-          <w:tcPr>
-            <w:tcW w:type="dxa" w:w="1440"/>
-          </w:tcPr>
-          <w:p>
-            <w:r>
-              <w:t>rf</w:t>
-            </w:r>
-          </w:p>
-        </w:tc>
-        <w:tc>
-          <w:tcPr>
-            <w:tcW w:type="dxa" w:w="1440"/>
-          </w:tcPr>
-          <w:p>
-            <w:r>
-              <w:t>age</w:t>
-            </w:r>
-          </w:p>
-        </w:tc>
-        <w:tc>
-          <w:tcPr>
-            <w:tcW w:type="dxa" w:w="1440"/>
-          </w:tcPr>
-          <w:p>
-            <w:r>
-              <w:t>0.1159</w:t>
-            </w:r>
-          </w:p>
-        </w:tc>
-        <w:tc>
-          <w:tcPr>
-            <w:tcW w:type="dxa" w:w="1440"/>
-          </w:tcPr>
-          <w:p>
-            <w:r>
-              <w:t>0.0251</w:t>
-            </w:r>
-          </w:p>
-        </w:tc>
-        <w:tc>
-          <w:tcPr>
-            <w:tcW w:type="dxa" w:w="1440"/>
-          </w:tcPr>
-          <w:p>
-            <w:r>
-              <w:t>0.1817</w:t>
-            </w:r>
-          </w:p>
-        </w:tc>
-      </w:tr>
-      <w:tr>
-        <w:tc>
-          <w:tcPr>
-            <w:tcW w:type="dxa" w:w="1440"/>
-          </w:tcPr>
-          <w:p>
-            <w:r>
-              <w:t>5</w:t>
-            </w:r>
-          </w:p>
-        </w:tc>
-        <w:tc>
-          <w:tcPr>
-            <w:tcW w:type="dxa" w:w="1440"/>
-          </w:tcPr>
-          <w:p>
-            <w:r>
-              <w:t>hgb</w:t>
-            </w:r>
-          </w:p>
-        </w:tc>
-        <w:tc>
-          <w:tcPr>
-            <w:tcW w:type="dxa" w:w="1440"/>
-          </w:tcPr>
-          <w:p>
-            <w:r>
-              <w:t>imd</w:t>
-            </w:r>
-          </w:p>
-        </w:tc>
-        <w:tc>
-          <w:tcPr>
-            <w:tcW w:type="dxa" w:w="1440"/>
-          </w:tcPr>
-          <w:p>
-            <w:r>
-              <w:t>0.0462</w:t>
-            </w:r>
-          </w:p>
-        </w:tc>
-        <w:tc>
-          <w:tcPr>
-            <w:tcW w:type="dxa" w:w="1440"/>
-          </w:tcPr>
-          <w:p>
-            <w:r>
-              <w:t>0.0115</w:t>
-            </w:r>
-          </w:p>
-        </w:tc>
-        <w:tc>
-          <w:tcPr>
-            <w:tcW w:type="dxa" w:w="1440"/>
-          </w:tcPr>
-          <w:p>
-            <w:r>
-              <w:t>0.0820</w:t>
-            </w:r>
-          </w:p>
-        </w:tc>
-      </w:tr>
-      <w:tr>
-        <w:tc>
-          <w:tcPr>
-            <w:tcW w:type="dxa" w:w="1440"/>
-          </w:tcPr>
-          <w:p>
-            <w:r>
-              <w:t>5</w:t>
-            </w:r>
-          </w:p>
-        </w:tc>
-        <w:tc>
-          <w:tcPr>
-            <w:tcW w:type="dxa" w:w="1440"/>
-          </w:tcPr>
-          <w:p>
-            <w:r>
-              <w:t>hgb</w:t>
-            </w:r>
-          </w:p>
-        </w:tc>
-        <w:tc>
-          <w:tcPr>
-            <w:tcW w:type="dxa" w:w="1440"/>
-          </w:tcPr>
-          <w:p>
-            <w:r>
-              <w:t>disability</w:t>
-            </w:r>
-          </w:p>
-        </w:tc>
-        <w:tc>
-          <w:tcPr>
-            <w:tcW w:type="dxa" w:w="1440"/>
-          </w:tcPr>
-          <w:p>
-            <w:r>
-              <w:t>0.0508</w:t>
-            </w:r>
-          </w:p>
-        </w:tc>
-        <w:tc>
-          <w:tcPr>
-            <w:tcW w:type="dxa" w:w="1440"/>
-          </w:tcPr>
-          <w:p>
-            <w:r>
-              <w:t>-0.0019</w:t>
-            </w:r>
-          </w:p>
-        </w:tc>
-        <w:tc>
-          <w:tcPr>
-            <w:tcW w:type="dxa" w:w="1440"/>
-          </w:tcPr>
-          <w:p>
-            <w:r>
-              <w:t>0.1029</w:t>
-            </w:r>
-          </w:p>
-        </w:tc>
-      </w:tr>
-      <w:tr>
-        <w:tc>
-          <w:tcPr>
-            <w:tcW w:type="dxa" w:w="1440"/>
-          </w:tcPr>
-          <w:p>
-            <w:r>
-              <w:t>5</w:t>
-            </w:r>
-          </w:p>
-        </w:tc>
-        <w:tc>
-          <w:tcPr>
-            <w:tcW w:type="dxa" w:w="1440"/>
-          </w:tcPr>
-          <w:p>
-            <w:r>
-              <w:t>hgb</w:t>
-            </w:r>
-          </w:p>
-        </w:tc>
-        <w:tc>
-          <w:tcPr>
-            <w:tcW w:type="dxa" w:w="1440"/>
-          </w:tcPr>
-          <w:p>
-            <w:r>
-              <w:t>age</w:t>
-            </w:r>
-          </w:p>
-        </w:tc>
-        <w:tc>
-          <w:tcPr>
-            <w:tcW w:type="dxa" w:w="1440"/>
-          </w:tcPr>
-          <w:p>
-            <w:r>
-              <w:t>0.0602</w:t>
-            </w:r>
-          </w:p>
-        </w:tc>
-        <w:tc>
-          <w:tcPr>
-            <w:tcW w:type="dxa" w:w="1440"/>
-          </w:tcPr>
-          <w:p>
-            <w:r>
-              <w:t>-0.0561</w:t>
-            </w:r>
-          </w:p>
-        </w:tc>
-        <w:tc>
-          <w:tcPr>
-            <w:tcW w:type="dxa" w:w="1440"/>
-          </w:tcPr>
-          <w:p>
-            <w:r>
-              <w:t>0.1564</w:t>
-            </w:r>
-          </w:p>
-        </w:tc>
-      </w:tr>
-      <w:tr>
-        <w:tc>
-          <w:tcPr>
-            <w:tcW w:type="dxa" w:w="1440"/>
-          </w:tcPr>
-          <w:p>
-            <w:r>
-              <w:t>10</w:t>
-            </w:r>
-          </w:p>
-        </w:tc>
-        <w:tc>
-          <w:tcPr>
-            <w:tcW w:type="dxa" w:w="1440"/>
-          </w:tcPr>
-          <w:p>
-            <w:r>
-              <w:t>logreg</w:t>
-            </w:r>
-          </w:p>
-        </w:tc>
-        <w:tc>
-          <w:tcPr>
-            <w:tcW w:type="dxa" w:w="1440"/>
-          </w:tcPr>
-          <w:p>
-            <w:r>
-              <w:t>imd</w:t>
-            </w:r>
-          </w:p>
-        </w:tc>
-        <w:tc>
-          <w:tcPr>
-            <w:tcW w:type="dxa" w:w="1440"/>
-          </w:tcPr>
-          <w:p>
-            <w:r>
-              <w:t>0.0713</w:t>
-            </w:r>
-          </w:p>
-        </w:tc>
-        <w:tc>
-          <w:tcPr>
-            <w:tcW w:type="dxa" w:w="1440"/>
-          </w:tcPr>
-          <w:p>
-            <w:r>
-              <w:t>0.0406</w:t>
-            </w:r>
-          </w:p>
-        </w:tc>
-        <w:tc>
-          <w:tcPr>
-            <w:tcW w:type="dxa" w:w="1440"/>
-          </w:tcPr>
-          <w:p>
-            <w:r>
-              <w:t>0.1072</w:t>
-            </w:r>
-          </w:p>
-        </w:tc>
-      </w:tr>
-      <w:tr>
-        <w:tc>
-          <w:tcPr>
-            <w:tcW w:type="dxa" w:w="1440"/>
-          </w:tcPr>
-          <w:p>
-            <w:r>
-              <w:t>10</w:t>
-            </w:r>
-          </w:p>
-        </w:tc>
-        <w:tc>
-          <w:tcPr>
-            <w:tcW w:type="dxa" w:w="1440"/>
-          </w:tcPr>
-          <w:p>
-            <w:r>
-              <w:t>logreg</w:t>
-            </w:r>
-          </w:p>
-        </w:tc>
-        <w:tc>
-          <w:tcPr>
-            <w:tcW w:type="dxa" w:w="1440"/>
-          </w:tcPr>
-          <w:p>
-            <w:r>
-              <w:t>disability</w:t>
-            </w:r>
-          </w:p>
-        </w:tc>
-        <w:tc>
-          <w:tcPr>
-            <w:tcW w:type="dxa" w:w="1440"/>
-          </w:tcPr>
-          <w:p>
-            <w:r>
-              <w:t>0.0473</w:t>
-            </w:r>
-          </w:p>
-        </w:tc>
-        <w:tc>
-          <w:tcPr>
-            <w:tcW w:type="dxa" w:w="1440"/>
-          </w:tcPr>
-          <w:p>
-            <w:r>
-              <w:t>-0.0016</w:t>
-            </w:r>
-          </w:p>
-        </w:tc>
-        <w:tc>
-          <w:tcPr>
-            <w:tcW w:type="dxa" w:w="1440"/>
-          </w:tcPr>
-          <w:p>
-            <w:r>
-              <w:t>0.0987</w:t>
-            </w:r>
-          </w:p>
-        </w:tc>
-      </w:tr>
-      <w:tr>
-        <w:tc>
-          <w:tcPr>
-            <w:tcW w:type="dxa" w:w="1440"/>
-          </w:tcPr>
-          <w:p>
-            <w:r>
-              <w:t>10</w:t>
-            </w:r>
-          </w:p>
-        </w:tc>
-        <w:tc>
-          <w:tcPr>
-            <w:tcW w:type="dxa" w:w="1440"/>
-          </w:tcPr>
-          <w:p>
-            <w:r>
-              <w:t>logreg</w:t>
-            </w:r>
-          </w:p>
-        </w:tc>
-        <w:tc>
-          <w:tcPr>
-            <w:tcW w:type="dxa" w:w="1440"/>
-          </w:tcPr>
-          <w:p>
-            <w:r>
-              <w:t>age</w:t>
-            </w:r>
-          </w:p>
-        </w:tc>
-        <w:tc>
-          <w:tcPr>
-            <w:tcW w:type="dxa" w:w="1440"/>
-          </w:tcPr>
-          <w:p>
-            <w:r>
-              <w:t>-0.0745</w:t>
-            </w:r>
-          </w:p>
-        </w:tc>
-        <w:tc>
-          <w:tcPr>
-            <w:tcW w:type="dxa" w:w="1440"/>
-          </w:tcPr>
-          <w:p>
-            <w:r>
-              <w:t>-0.2213</w:t>
-            </w:r>
-          </w:p>
-        </w:tc>
-        <w:tc>
-          <w:tcPr>
-            <w:tcW w:type="dxa" w:w="1440"/>
-          </w:tcPr>
-          <w:p>
-            <w:r>
-              <w:t>0.0508</w:t>
-            </w:r>
-          </w:p>
-        </w:tc>
-      </w:tr>
-      <w:tr>
-        <w:tc>
-          <w:tcPr>
-            <w:tcW w:type="dxa" w:w="1440"/>
-          </w:tcPr>
-          <w:p>
-            <w:r>
-              <w:t>10</w:t>
-            </w:r>
-          </w:p>
-        </w:tc>
-        <w:tc>
-          <w:tcPr>
-            <w:tcW w:type="dxa" w:w="1440"/>
-          </w:tcPr>
-          <w:p>
-            <w:r>
-              <w:t>rf</w:t>
-            </w:r>
-          </w:p>
-        </w:tc>
-        <w:tc>
-          <w:tcPr>
-            <w:tcW w:type="dxa" w:w="1440"/>
-          </w:tcPr>
-          <w:p>
-            <w:r>
-              <w:t>imd</w:t>
-            </w:r>
-          </w:p>
-        </w:tc>
-        <w:tc>
-          <w:tcPr>
-            <w:tcW w:type="dxa" w:w="1440"/>
-          </w:tcPr>
-          <w:p>
-            <w:r>
-              <w:t>0.0375</w:t>
-            </w:r>
-          </w:p>
-        </w:tc>
-        <w:tc>
-          <w:tcPr>
-            <w:tcW w:type="dxa" w:w="1440"/>
-          </w:tcPr>
-          <w:p>
-            <w:r>
-              <w:t>0.0028</w:t>
-            </w:r>
-          </w:p>
-        </w:tc>
-        <w:tc>
-          <w:tcPr>
-            <w:tcW w:type="dxa" w:w="1440"/>
-          </w:tcPr>
-          <w:p>
-            <w:r>
-              <w:t>0.0731</w:t>
-            </w:r>
-          </w:p>
-        </w:tc>
-      </w:tr>
-      <w:tr>
-        <w:tc>
-          <w:tcPr>
-            <w:tcW w:type="dxa" w:w="1440"/>
-          </w:tcPr>
-          <w:p>
-            <w:r>
-              <w:t>10</w:t>
-            </w:r>
-          </w:p>
-        </w:tc>
-        <w:tc>
-          <w:tcPr>
-            <w:tcW w:type="dxa" w:w="1440"/>
-          </w:tcPr>
-          <w:p>
-            <w:r>
-              <w:t>rf</w:t>
-            </w:r>
-          </w:p>
-        </w:tc>
-        <w:tc>
-          <w:tcPr>
-            <w:tcW w:type="dxa" w:w="1440"/>
-          </w:tcPr>
-          <w:p>
-            <w:r>
-              <w:t>disability</w:t>
-            </w:r>
-          </w:p>
-        </w:tc>
-        <w:tc>
-          <w:tcPr>
-            <w:tcW w:type="dxa" w:w="1440"/>
-          </w:tcPr>
-          <w:p>
-            <w:r>
-              <w:t>0.0537</w:t>
-            </w:r>
-          </w:p>
-        </w:tc>
-        <w:tc>
-          <w:tcPr>
-            <w:tcW w:type="dxa" w:w="1440"/>
-          </w:tcPr>
-          <w:p>
-            <w:r>
-              <w:t>0.0028</w:t>
-            </w:r>
-          </w:p>
-        </w:tc>
-        <w:tc>
-          <w:tcPr>
-            <w:tcW w:type="dxa" w:w="1440"/>
-          </w:tcPr>
-          <w:p>
-            <w:r>
-              <w:t>0.1034</w:t>
-            </w:r>
-          </w:p>
-        </w:tc>
-      </w:tr>
-      <w:tr>
-        <w:tc>
-          <w:tcPr>
-            <w:tcW w:type="dxa" w:w="1440"/>
-          </w:tcPr>
-          <w:p>
-            <w:r>
-              <w:t>10</w:t>
-            </w:r>
-          </w:p>
-        </w:tc>
-        <w:tc>
-          <w:tcPr>
-            <w:tcW w:type="dxa" w:w="1440"/>
-          </w:tcPr>
-          <w:p>
-            <w:r>
-              <w:t>rf</w:t>
-            </w:r>
-          </w:p>
-        </w:tc>
-        <w:tc>
-          <w:tcPr>
-            <w:tcW w:type="dxa" w:w="1440"/>
-          </w:tcPr>
-          <w:p>
-            <w:r>
-              <w:t>age</w:t>
-            </w:r>
-          </w:p>
-        </w:tc>
-        <w:tc>
-          <w:tcPr>
-            <w:tcW w:type="dxa" w:w="1440"/>
-          </w:tcPr>
-          <w:p>
-            <w:r>
-              <w:t>-0.0051</w:t>
-            </w:r>
-          </w:p>
-        </w:tc>
-        <w:tc>
-          <w:tcPr>
-            <w:tcW w:type="dxa" w:w="1440"/>
-          </w:tcPr>
-          <w:p>
-            <w:r>
-              <w:t>-0.1347</w:t>
-            </w:r>
-          </w:p>
-        </w:tc>
-        <w:tc>
-          <w:tcPr>
-            <w:tcW w:type="dxa" w:w="1440"/>
-          </w:tcPr>
-          <w:p>
-            <w:r>
-              <w:t>0.1058</w:t>
-            </w:r>
-          </w:p>
-        </w:tc>
-      </w:tr>
-      <w:tr>
-        <w:tc>
-          <w:tcPr>
-            <w:tcW w:type="dxa" w:w="1440"/>
-          </w:tcPr>
-          <w:p>
-            <w:r>
-              <w:t>10</w:t>
-            </w:r>
-          </w:p>
-        </w:tc>
-        <w:tc>
-          <w:tcPr>
-            <w:tcW w:type="dxa" w:w="1440"/>
-          </w:tcPr>
-          <w:p>
-            <w:r>
-              <w:t>hgb</w:t>
-            </w:r>
-          </w:p>
-        </w:tc>
-        <w:tc>
-          <w:tcPr>
-            <w:tcW w:type="dxa" w:w="1440"/>
-          </w:tcPr>
-          <w:p>
-            <w:r>
-              <w:t>imd</w:t>
-            </w:r>
-          </w:p>
-        </w:tc>
-        <w:tc>
-          <w:tcPr>
-            <w:tcW w:type="dxa" w:w="1440"/>
-          </w:tcPr>
-          <w:p>
-            <w:r>
-              <w:t>0.0621</w:t>
-            </w:r>
-          </w:p>
-        </w:tc>
-        <w:tc>
-          <w:tcPr>
-            <w:tcW w:type="dxa" w:w="1440"/>
-          </w:tcPr>
-          <w:p>
-            <w:r>
-              <w:t>0.0304</w:t>
-            </w:r>
-          </w:p>
-        </w:tc>
-        <w:tc>
-          <w:tcPr>
-            <w:tcW w:type="dxa" w:w="1440"/>
-          </w:tcPr>
-          <w:p>
-            <w:r>
-              <w:t>0.0947</w:t>
-            </w:r>
-          </w:p>
-        </w:tc>
-      </w:tr>
-      <w:tr>
-        <w:tc>
-          <w:tcPr>
-            <w:tcW w:type="dxa" w:w="1440"/>
-          </w:tcPr>
-          <w:p>
-            <w:r>
-              <w:t>10</w:t>
-            </w:r>
-          </w:p>
-        </w:tc>
-        <w:tc>
-          <w:tcPr>
-            <w:tcW w:type="dxa" w:w="1440"/>
-          </w:tcPr>
-          <w:p>
-            <w:r>
-              <w:t>hgb</w:t>
-            </w:r>
-          </w:p>
-        </w:tc>
-        <w:tc>
-          <w:tcPr>
-            <w:tcW w:type="dxa" w:w="1440"/>
-          </w:tcPr>
-          <w:p>
-            <w:r>
-              <w:t>disability</w:t>
-            </w:r>
-          </w:p>
-        </w:tc>
-        <w:tc>
-          <w:tcPr>
-            <w:tcW w:type="dxa" w:w="1440"/>
-          </w:tcPr>
-          <w:p>
-            <w:r>
-              <w:t>0.0538</w:t>
-            </w:r>
-          </w:p>
-        </w:tc>
-        <w:tc>
-          <w:tcPr>
-            <w:tcW w:type="dxa" w:w="1440"/>
-          </w:tcPr>
-          <w:p>
-            <w:r>
-              <w:t>0.0031</w:t>
-            </w:r>
-          </w:p>
-        </w:tc>
-        <w:tc>
-          <w:tcPr>
-            <w:tcW w:type="dxa" w:w="1440"/>
-          </w:tcPr>
-          <w:p>
-            <w:r>
-              <w:t>0.1037</w:t>
-            </w:r>
-          </w:p>
-        </w:tc>
-      </w:tr>
-      <w:tr>
-        <w:tc>
-          <w:tcPr>
-            <w:tcW w:type="dxa" w:w="1440"/>
-          </w:tcPr>
-          <w:p>
-            <w:r>
-              <w:t>10</w:t>
-            </w:r>
-          </w:p>
-        </w:tc>
-        <w:tc>
-          <w:tcPr>
-            <w:tcW w:type="dxa" w:w="1440"/>
-          </w:tcPr>
-          <w:p>
-            <w:r>
-              <w:t>hgb</w:t>
-            </w:r>
-          </w:p>
-        </w:tc>
-        <w:tc>
-          <w:tcPr>
-            <w:tcW w:type="dxa" w:w="1440"/>
-          </w:tcPr>
-          <w:p>
-            <w:r>
-              <w:t>age</w:t>
-            </w:r>
-          </w:p>
-        </w:tc>
-        <w:tc>
-          <w:tcPr>
-            <w:tcW w:type="dxa" w:w="1440"/>
-          </w:tcPr>
-          <w:p>
-            <w:r>
-              <w:t>-0.0223</w:t>
-            </w:r>
-          </w:p>
-        </w:tc>
-        <w:tc>
-          <w:tcPr>
-            <w:tcW w:type="dxa" w:w="1440"/>
-          </w:tcPr>
-          <w:p>
-            <w:r>
-              <w:t>-0.1571</w:t>
-            </w:r>
-          </w:p>
-        </w:tc>
-        <w:tc>
-          <w:tcPr>
-            <w:tcW w:type="dxa" w:w="1440"/>
-          </w:tcPr>
-          <w:p>
-            <w:r>
-              <w:t>0.0877</w:t>
-            </w:r>
-          </w:p>
-        </w:tc>
-      </w:tr>
-      <w:tr>
-        <w:tc>
-          <w:tcPr>
-            <w:tcW w:type="dxa" w:w="1440"/>
-          </w:tcPr>
-          <w:p>
-            <w:r>
-              <w:t>15</w:t>
-            </w:r>
-          </w:p>
-        </w:tc>
-        <w:tc>
-          <w:tcPr>
-            <w:tcW w:type="dxa" w:w="1440"/>
-          </w:tcPr>
-          <w:p>
-            <w:r>
-              <w:t>logreg</w:t>
-            </w:r>
-          </w:p>
-        </w:tc>
-        <w:tc>
-          <w:tcPr>
-            <w:tcW w:type="dxa" w:w="1440"/>
-          </w:tcPr>
-          <w:p>
-            <w:r>
-              <w:t>imd</w:t>
-            </w:r>
-          </w:p>
-        </w:tc>
-        <w:tc>
-          <w:tcPr>
-            <w:tcW w:type="dxa" w:w="1440"/>
-          </w:tcPr>
-          <w:p>
-            <w:r>
-              <w:t>0.0537</w:t>
-            </w:r>
-          </w:p>
-        </w:tc>
-        <w:tc>
-          <w:tcPr>
-            <w:tcW w:type="dxa" w:w="1440"/>
-          </w:tcPr>
-          <w:p>
-            <w:r>
-              <w:t>0.0250</w:t>
-            </w:r>
-          </w:p>
-        </w:tc>
-        <w:tc>
-          <w:tcPr>
-            <w:tcW w:type="dxa" w:w="1440"/>
-          </w:tcPr>
-          <w:p>
-            <w:r>
-              <w:t>0.0844</w:t>
-            </w:r>
-          </w:p>
-        </w:tc>
-      </w:tr>
-      <w:tr>
-        <w:tc>
-          <w:tcPr>
-            <w:tcW w:type="dxa" w:w="1440"/>
-          </w:tcPr>
-          <w:p>
-            <w:r>
-              <w:t>15</w:t>
-            </w:r>
-          </w:p>
-        </w:tc>
-        <w:tc>
-          <w:tcPr>
-            <w:tcW w:type="dxa" w:w="1440"/>
-          </w:tcPr>
-          <w:p>
-            <w:r>
-              <w:t>logreg</w:t>
-            </w:r>
-          </w:p>
-        </w:tc>
-        <w:tc>
-          <w:tcPr>
-            <w:tcW w:type="dxa" w:w="1440"/>
-          </w:tcPr>
-          <w:p>
-            <w:r>
-              <w:t>disability</w:t>
-            </w:r>
-          </w:p>
-        </w:tc>
-        <w:tc>
-          <w:tcPr>
-            <w:tcW w:type="dxa" w:w="1440"/>
-          </w:tcPr>
-          <w:p>
-            <w:r>
-              <w:t>0.0560</w:t>
-            </w:r>
-          </w:p>
-        </w:tc>
-        <w:tc>
-          <w:tcPr>
-            <w:tcW w:type="dxa" w:w="1440"/>
-          </w:tcPr>
-          <w:p>
-            <w:r>
-              <w:t>0.0109</w:t>
-            </w:r>
-          </w:p>
-        </w:tc>
-        <w:tc>
-          <w:tcPr>
-            <w:tcW w:type="dxa" w:w="1440"/>
-          </w:tcPr>
-          <w:p>
-            <w:r>
-              <w:t>0.1087</w:t>
-            </w:r>
-          </w:p>
-        </w:tc>
-      </w:tr>
-      <w:tr>
-        <w:tc>
-          <w:tcPr>
-            <w:tcW w:type="dxa" w:w="1440"/>
-          </w:tcPr>
-          <w:p>
-            <w:r>
-              <w:t>15</w:t>
-            </w:r>
-          </w:p>
-        </w:tc>
-        <w:tc>
-          <w:tcPr>
-            <w:tcW w:type="dxa" w:w="1440"/>
-          </w:tcPr>
-          <w:p>
-            <w:r>
-              <w:t>logreg</w:t>
-            </w:r>
-          </w:p>
-        </w:tc>
-        <w:tc>
-          <w:tcPr>
-            <w:tcW w:type="dxa" w:w="1440"/>
-          </w:tcPr>
-          <w:p>
-            <w:r>
-              <w:t>age</w:t>
-            </w:r>
-          </w:p>
-        </w:tc>
-        <w:tc>
-          <w:tcPr>
-            <w:tcW w:type="dxa" w:w="1440"/>
-          </w:tcPr>
-          <w:p>
-            <w:r>
-              <w:t>-0.0201</w:t>
-            </w:r>
-          </w:p>
-        </w:tc>
-        <w:tc>
-          <w:tcPr>
-            <w:tcW w:type="dxa" w:w="1440"/>
-          </w:tcPr>
-          <w:p>
-            <w:r>
-              <w:t>-0.1489</w:t>
-            </w:r>
-          </w:p>
-        </w:tc>
-        <w:tc>
-          <w:tcPr>
-            <w:tcW w:type="dxa" w:w="1440"/>
-          </w:tcPr>
-          <w:p>
-            <w:r>
-              <w:t>0.0732</w:t>
-            </w:r>
-          </w:p>
-        </w:tc>
-      </w:tr>
-      <w:tr>
-        <w:tc>
-          <w:tcPr>
-            <w:tcW w:type="dxa" w:w="1440"/>
-          </w:tcPr>
-          <w:p>
-            <w:r>
-              <w:t>15</w:t>
-            </w:r>
-          </w:p>
-        </w:tc>
-        <w:tc>
-          <w:tcPr>
-            <w:tcW w:type="dxa" w:w="1440"/>
-          </w:tcPr>
-          <w:p>
-            <w:r>
-              <w:t>rf</w:t>
-            </w:r>
-          </w:p>
-        </w:tc>
-        <w:tc>
-          <w:tcPr>
-            <w:tcW w:type="dxa" w:w="1440"/>
-          </w:tcPr>
-          <w:p>
-            <w:r>
-              <w:t>imd</w:t>
-            </w:r>
-          </w:p>
-        </w:tc>
-        <w:tc>
-          <w:tcPr>
-            <w:tcW w:type="dxa" w:w="1440"/>
-          </w:tcPr>
-          <w:p>
-            <w:r>
-              <w:t>0.0479</w:t>
-            </w:r>
-          </w:p>
-        </w:tc>
-        <w:tc>
-          <w:tcPr>
-            <w:tcW w:type="dxa" w:w="1440"/>
-          </w:tcPr>
-          <w:p>
-            <w:r>
-              <w:t>0.0162</w:t>
-            </w:r>
-          </w:p>
-        </w:tc>
-        <w:tc>
-          <w:tcPr>
-            <w:tcW w:type="dxa" w:w="1440"/>
-          </w:tcPr>
-          <w:p>
-            <w:r>
-              <w:t>0.0810</w:t>
-            </w:r>
-          </w:p>
-        </w:tc>
-      </w:tr>
-      <w:tr>
-        <w:tc>
-          <w:tcPr>
-            <w:tcW w:type="dxa" w:w="1440"/>
-          </w:tcPr>
-          <w:p>
-            <w:r>
-              <w:t>15</w:t>
-            </w:r>
-          </w:p>
-        </w:tc>
-        <w:tc>
-          <w:tcPr>
-            <w:tcW w:type="dxa" w:w="1440"/>
-          </w:tcPr>
-          <w:p>
-            <w:r>
-              <w:t>rf</w:t>
-            </w:r>
-          </w:p>
-        </w:tc>
-        <w:tc>
-          <w:tcPr>
-            <w:tcW w:type="dxa" w:w="1440"/>
-          </w:tcPr>
-          <w:p>
-            <w:r>
-              <w:t>disability</w:t>
-            </w:r>
-          </w:p>
-        </w:tc>
-        <w:tc>
-          <w:tcPr>
-            <w:tcW w:type="dxa" w:w="1440"/>
-          </w:tcPr>
-          <w:p>
-            <w:r>
-              <w:t>0.0843</w:t>
-            </w:r>
-          </w:p>
-        </w:tc>
-        <w:tc>
-          <w:tcPr>
-            <w:tcW w:type="dxa" w:w="1440"/>
-          </w:tcPr>
-          <w:p>
-            <w:r>
-              <w:t>0.0344</w:t>
-            </w:r>
-          </w:p>
-        </w:tc>
-        <w:tc>
-          <w:tcPr>
-            <w:tcW w:type="dxa" w:w="1440"/>
-          </w:tcPr>
-          <w:p>
-            <w:r>
-              <w:t>0.1369</w:t>
-            </w:r>
-          </w:p>
-        </w:tc>
-      </w:tr>
-      <w:tr>
-        <w:tc>
-          <w:tcPr>
-            <w:tcW w:type="dxa" w:w="1440"/>
-          </w:tcPr>
-          <w:p>
-            <w:r>
-              <w:t>15</w:t>
-            </w:r>
-          </w:p>
-        </w:tc>
-        <w:tc>
-          <w:tcPr>
-            <w:tcW w:type="dxa" w:w="1440"/>
-          </w:tcPr>
-          <w:p>
-            <w:r>
-              <w:t>rf</w:t>
-            </w:r>
-          </w:p>
-        </w:tc>
-        <w:tc>
-          <w:tcPr>
-            <w:tcW w:type="dxa" w:w="1440"/>
-          </w:tcPr>
-          <w:p>
-            <w:r>
-              <w:t>age</w:t>
-            </w:r>
-          </w:p>
-        </w:tc>
-        <w:tc>
-          <w:tcPr>
-            <w:tcW w:type="dxa" w:w="1440"/>
-          </w:tcPr>
-          <w:p>
-            <w:r>
-              <w:t>0.0358</w:t>
-            </w:r>
-          </w:p>
-        </w:tc>
-        <w:tc>
-          <w:tcPr>
-            <w:tcW w:type="dxa" w:w="1440"/>
-          </w:tcPr>
-          <w:p>
-            <w:r>
-              <w:t>-0.0726</w:t>
-            </w:r>
-          </w:p>
-        </w:tc>
-        <w:tc>
-          <w:tcPr>
-            <w:tcW w:type="dxa" w:w="1440"/>
-          </w:tcPr>
-          <w:p>
-            <w:r>
-              <w:t>0.1256</w:t>
-            </w:r>
-          </w:p>
-        </w:tc>
-      </w:tr>
-      <w:tr>
-        <w:tc>
-          <w:tcPr>
-            <w:tcW w:type="dxa" w:w="1440"/>
-          </w:tcPr>
-          <w:p>
-            <w:r>
-              <w:t>15</w:t>
-            </w:r>
-          </w:p>
-        </w:tc>
-        <w:tc>
-          <w:tcPr>
-            <w:tcW w:type="dxa" w:w="1440"/>
-          </w:tcPr>
-          <w:p>
-            <w:r>
-              <w:t>hgb</w:t>
-            </w:r>
-          </w:p>
-        </w:tc>
-        <w:tc>
-          <w:tcPr>
-            <w:tcW w:type="dxa" w:w="1440"/>
-          </w:tcPr>
-          <w:p>
-            <w:r>
-              <w:t>imd</w:t>
-            </w:r>
-          </w:p>
-        </w:tc>
-        <w:tc>
-          <w:tcPr>
-            <w:tcW w:type="dxa" w:w="1440"/>
-          </w:tcPr>
-          <w:p>
-            <w:r>
-              <w:t>0.0319</w:t>
-            </w:r>
-          </w:p>
-        </w:tc>
-        <w:tc>
-          <w:tcPr>
-            <w:tcW w:type="dxa" w:w="1440"/>
-          </w:tcPr>
-          <w:p>
-            <w:r>
-              <w:t>0.0068</w:t>
-            </w:r>
-          </w:p>
-        </w:tc>
-        <w:tc>
-          <w:tcPr>
-            <w:tcW w:type="dxa" w:w="1440"/>
-          </w:tcPr>
-          <w:p>
-            <w:r>
-              <w:t>0.0579</w:t>
-            </w:r>
-          </w:p>
-        </w:tc>
-      </w:tr>
-      <w:tr>
-        <w:tc>
-          <w:tcPr>
-            <w:tcW w:type="dxa" w:w="1440"/>
-          </w:tcPr>
-          <w:p>
-            <w:r>
-              <w:t>15</w:t>
-            </w:r>
-          </w:p>
-        </w:tc>
-        <w:tc>
-          <w:tcPr>
-            <w:tcW w:type="dxa" w:w="1440"/>
-          </w:tcPr>
-          <w:p>
-            <w:r>
-              <w:t>hgb</w:t>
-            </w:r>
-          </w:p>
-        </w:tc>
-        <w:tc>
-          <w:tcPr>
-            <w:tcW w:type="dxa" w:w="1440"/>
-          </w:tcPr>
-          <w:p>
-            <w:r>
-              <w:t>disability</w:t>
-            </w:r>
-          </w:p>
-        </w:tc>
-        <w:tc>
-          <w:tcPr>
-            <w:tcW w:type="dxa" w:w="1440"/>
-          </w:tcPr>
-          <w:p>
-            <w:r>
-              <w:t>0.0590</w:t>
-            </w:r>
-          </w:p>
-        </w:tc>
-        <w:tc>
-          <w:tcPr>
-            <w:tcW w:type="dxa" w:w="1440"/>
-          </w:tcPr>
-          <w:p>
-            <w:r>
-              <w:t>0.0183</w:t>
-            </w:r>
-          </w:p>
-        </w:tc>
-        <w:tc>
-          <w:tcPr>
-            <w:tcW w:type="dxa" w:w="1440"/>
-          </w:tcPr>
-          <w:p>
-            <w:r>
-              <w:t>0.1044</w:t>
-            </w:r>
-          </w:p>
-        </w:tc>
-      </w:tr>
-      <w:tr>
-        <w:tc>
-          <w:tcPr>
-            <w:tcW w:type="dxa" w:w="1440"/>
-          </w:tcPr>
-          <w:p>
-            <w:r>
-              <w:t>15</w:t>
-            </w:r>
-          </w:p>
-        </w:tc>
-        <w:tc>
-          <w:tcPr>
-            <w:tcW w:type="dxa" w:w="1440"/>
-          </w:tcPr>
-          <w:p>
-            <w:r>
-              <w:t>hgb</w:t>
-            </w:r>
-          </w:p>
-        </w:tc>
-        <w:tc>
-          <w:tcPr>
-            <w:tcW w:type="dxa" w:w="1440"/>
-          </w:tcPr>
-          <w:p>
-            <w:r>
-              <w:t>age</w:t>
-            </w:r>
-          </w:p>
-        </w:tc>
-        <w:tc>
-          <w:tcPr>
-            <w:tcW w:type="dxa" w:w="1440"/>
-          </w:tcPr>
-          <w:p>
-            <w:r>
-              <w:t>-0.0095</w:t>
-            </w:r>
-          </w:p>
-        </w:tc>
-        <w:tc>
-          <w:tcPr>
-            <w:tcW w:type="dxa" w:w="1440"/>
-          </w:tcPr>
-          <w:p>
-            <w:r>
-              <w:t>-0.1187</w:t>
-            </w:r>
-          </w:p>
-        </w:tc>
-        <w:tc>
-          <w:tcPr>
-            <w:tcW w:type="dxa" w:w="1440"/>
-          </w:tcPr>
-          <w:p>
-            <w:r>
-              <w:t>0.0799</w:t>
-            </w:r>
-          </w:p>
-        </w:tc>
-      </w:tr>
-      <w:tr>
-        <w:tc>
-          <w:tcPr>
-            <w:tcW w:type="dxa" w:w="1440"/>
-          </w:tcPr>
-          <w:p>
-            <w:r>
-              <w:t>25</w:t>
-            </w:r>
-          </w:p>
-        </w:tc>
-        <w:tc>
-          <w:tcPr>
-            <w:tcW w:type="dxa" w:w="1440"/>
-          </w:tcPr>
-          <w:p>
-            <w:r>
-              <w:t>logreg</w:t>
-            </w:r>
-          </w:p>
-        </w:tc>
-        <w:tc>
-          <w:tcPr>
-            <w:tcW w:type="dxa" w:w="1440"/>
-          </w:tcPr>
-          <w:p>
-            <w:r>
-              <w:t>imd</w:t>
-            </w:r>
-          </w:p>
-        </w:tc>
-        <w:tc>
-          <w:tcPr>
-            <w:tcW w:type="dxa" w:w="1440"/>
-          </w:tcPr>
-          <w:p>
-            <w:r>
-              <w:t>0.0211</w:t>
-            </w:r>
-          </w:p>
-        </w:tc>
-        <w:tc>
-          <w:tcPr>
-            <w:tcW w:type="dxa" w:w="1440"/>
-          </w:tcPr>
-          <w:p>
-            <w:r>
-              <w:t>-0.0012</w:t>
-            </w:r>
-          </w:p>
-        </w:tc>
-        <w:tc>
-          <w:tcPr>
-            <w:tcW w:type="dxa" w:w="1440"/>
-          </w:tcPr>
-          <w:p>
-            <w:r>
-              <w:t>0.0428</w:t>
-            </w:r>
-          </w:p>
-        </w:tc>
-      </w:tr>
-      <w:tr>
-        <w:tc>
-          <w:tcPr>
-            <w:tcW w:type="dxa" w:w="1440"/>
-          </w:tcPr>
-          <w:p>
-            <w:r>
-              <w:t>25</w:t>
-            </w:r>
-          </w:p>
-        </w:tc>
-        <w:tc>
-          <w:tcPr>
-            <w:tcW w:type="dxa" w:w="1440"/>
-          </w:tcPr>
-          <w:p>
-            <w:r>
-              <w:t>logreg</w:t>
-            </w:r>
-          </w:p>
-        </w:tc>
-        <w:tc>
-          <w:tcPr>
-            <w:tcW w:type="dxa" w:w="1440"/>
-          </w:tcPr>
-          <w:p>
-            <w:r>
-              <w:t>disability</w:t>
-            </w:r>
-          </w:p>
-        </w:tc>
-        <w:tc>
-          <w:tcPr>
-            <w:tcW w:type="dxa" w:w="1440"/>
-          </w:tcPr>
-          <w:p>
-            <w:r>
-              <w:t>0.0324</w:t>
-            </w:r>
-          </w:p>
-        </w:tc>
-        <w:tc>
-          <w:tcPr>
-            <w:tcW w:type="dxa" w:w="1440"/>
-          </w:tcPr>
-          <w:p>
-            <w:r>
-              <w:t>-0.0031</w:t>
-            </w:r>
-          </w:p>
-        </w:tc>
-        <w:tc>
-          <w:tcPr>
-            <w:tcW w:type="dxa" w:w="1440"/>
-          </w:tcPr>
-          <w:p>
-            <w:r>
-              <w:t>0.0696</w:t>
-            </w:r>
-          </w:p>
-        </w:tc>
-      </w:tr>
-      <w:tr>
-        <w:tc>
-          <w:tcPr>
-            <w:tcW w:type="dxa" w:w="1440"/>
-          </w:tcPr>
-          <w:p>
-            <w:r>
-              <w:t>25</w:t>
-            </w:r>
-          </w:p>
-        </w:tc>
-        <w:tc>
-          <w:tcPr>
-            <w:tcW w:type="dxa" w:w="1440"/>
-          </w:tcPr>
-          <w:p>
-            <w:r>
-              <w:t>logreg</w:t>
-            </w:r>
-          </w:p>
-        </w:tc>
-        <w:tc>
-          <w:tcPr>
-            <w:tcW w:type="dxa" w:w="1440"/>
-          </w:tcPr>
-          <w:p>
-            <w:r>
-              <w:t>age</w:t>
-            </w:r>
-          </w:p>
-        </w:tc>
-        <w:tc>
-          <w:tcPr>
-            <w:tcW w:type="dxa" w:w="1440"/>
-          </w:tcPr>
-          <w:p>
-            <w:r>
-              <w:t>-0.0009</w:t>
-            </w:r>
-          </w:p>
-        </w:tc>
-        <w:tc>
-          <w:tcPr>
-            <w:tcW w:type="dxa" w:w="1440"/>
-          </w:tcPr>
-          <w:p>
-            <w:r>
-              <w:t>-0.1023</w:t>
-            </w:r>
-          </w:p>
-        </w:tc>
-        <w:tc>
-          <w:tcPr>
-            <w:tcW w:type="dxa" w:w="1440"/>
-          </w:tcPr>
-          <w:p>
-            <w:r>
-              <w:t>0.0637</w:t>
-            </w:r>
-          </w:p>
-        </w:tc>
-      </w:tr>
-      <w:tr>
-        <w:tc>
-          <w:tcPr>
-            <w:tcW w:type="dxa" w:w="1440"/>
-          </w:tcPr>
-          <w:p>
-            <w:r>
-              <w:t>25</w:t>
-            </w:r>
-          </w:p>
-        </w:tc>
-        <w:tc>
-          <w:tcPr>
-            <w:tcW w:type="dxa" w:w="1440"/>
-          </w:tcPr>
-          <w:p>
-            <w:r>
-              <w:t>rf</w:t>
-            </w:r>
-          </w:p>
-        </w:tc>
-        <w:tc>
-          <w:tcPr>
-            <w:tcW w:type="dxa" w:w="1440"/>
-          </w:tcPr>
-          <w:p>
-            <w:r>
-              <w:t>imd</w:t>
-            </w:r>
-          </w:p>
-        </w:tc>
-        <w:tc>
-          <w:tcPr>
-            <w:tcW w:type="dxa" w:w="1440"/>
-          </w:tcPr>
-          <w:p>
-            <w:r>
-              <w:t>0.0272</w:t>
-            </w:r>
-          </w:p>
-        </w:tc>
-        <w:tc>
-          <w:tcPr>
-            <w:tcW w:type="dxa" w:w="1440"/>
-          </w:tcPr>
-          <w:p>
-            <w:r>
-              <w:t>0.0084</w:t>
-            </w:r>
-          </w:p>
-        </w:tc>
-        <w:tc>
-          <w:tcPr>
-            <w:tcW w:type="dxa" w:w="1440"/>
-          </w:tcPr>
-          <w:p>
-            <w:r>
-              <w:t>0.0462</w:t>
-            </w:r>
-          </w:p>
-        </w:tc>
-      </w:tr>
-      <w:tr>
-        <w:tc>
-          <w:tcPr>
-            <w:tcW w:type="dxa" w:w="1440"/>
-          </w:tcPr>
-          <w:p>
-            <w:r>
-              <w:t>25</w:t>
-            </w:r>
-          </w:p>
-        </w:tc>
-        <w:tc>
-          <w:tcPr>
-            <w:tcW w:type="dxa" w:w="1440"/>
-          </w:tcPr>
-          <w:p>
-            <w:r>
-              <w:t>rf</w:t>
-            </w:r>
-          </w:p>
-        </w:tc>
-        <w:tc>
-          <w:tcPr>
-            <w:tcW w:type="dxa" w:w="1440"/>
-          </w:tcPr>
-          <w:p>
-            <w:r>
-              <w:t>disability</w:t>
-            </w:r>
-          </w:p>
-        </w:tc>
-        <w:tc>
-          <w:tcPr>
-            <w:tcW w:type="dxa" w:w="1440"/>
-          </w:tcPr>
-          <w:p>
-            <w:r>
-              <w:t>-0.0010</w:t>
-            </w:r>
-          </w:p>
-        </w:tc>
-        <w:tc>
-          <w:tcPr>
-            <w:tcW w:type="dxa" w:w="1440"/>
-          </w:tcPr>
-          <w:p>
-            <w:r>
-              <w:t>-0.0260</w:t>
-            </w:r>
-          </w:p>
-        </w:tc>
-        <w:tc>
-          <w:tcPr>
-            <w:tcW w:type="dxa" w:w="1440"/>
-          </w:tcPr>
-          <w:p>
-            <w:r>
-              <w:t>0.0254</w:t>
-            </w:r>
-          </w:p>
-        </w:tc>
-      </w:tr>
-      <w:tr>
-        <w:tc>
-          <w:tcPr>
-            <w:tcW w:type="dxa" w:w="1440"/>
-          </w:tcPr>
-          <w:p>
-            <w:r>
-              <w:t>25</w:t>
-            </w:r>
-          </w:p>
-        </w:tc>
-        <w:tc>
-          <w:tcPr>
-            <w:tcW w:type="dxa" w:w="1440"/>
-          </w:tcPr>
-          <w:p>
-            <w:r>
-              <w:t>rf</w:t>
-            </w:r>
-          </w:p>
-        </w:tc>
-        <w:tc>
-          <w:tcPr>
-            <w:tcW w:type="dxa" w:w="1440"/>
-          </w:tcPr>
-          <w:p>
-            <w:r>
-              <w:t>age</w:t>
-            </w:r>
-          </w:p>
-        </w:tc>
-        <w:tc>
-          <w:tcPr>
-            <w:tcW w:type="dxa" w:w="1440"/>
-          </w:tcPr>
-          <w:p>
-            <w:r>
-              <w:t>-0.0103</w:t>
-            </w:r>
-          </w:p>
-        </w:tc>
-        <w:tc>
-          <w:tcPr>
-            <w:tcW w:type="dxa" w:w="1440"/>
-          </w:tcPr>
-          <w:p>
-            <w:r>
-              <w:t>-0.1071</w:t>
-            </w:r>
-          </w:p>
-        </w:tc>
-        <w:tc>
-          <w:tcPr>
-            <w:tcW w:type="dxa" w:w="1440"/>
-          </w:tcPr>
-          <w:p>
-            <w:r>
-              <w:t>0.0538</w:t>
-            </w:r>
-          </w:p>
-        </w:tc>
-      </w:tr>
-      <w:tr>
-        <w:tc>
-          <w:tcPr>
-            <w:tcW w:type="dxa" w:w="1440"/>
-          </w:tcPr>
-          <w:p>
-            <w:r>
-              <w:t>25</w:t>
-            </w:r>
-          </w:p>
-        </w:tc>
-        <w:tc>
-          <w:tcPr>
-            <w:tcW w:type="dxa" w:w="1440"/>
-          </w:tcPr>
-          <w:p>
-            <w:r>
-              <w:t>hgb</w:t>
-            </w:r>
-          </w:p>
-        </w:tc>
-        <w:tc>
-          <w:tcPr>
-            <w:tcW w:type="dxa" w:w="1440"/>
-          </w:tcPr>
-          <w:p>
-            <w:r>
-              <w:t>imd</w:t>
-            </w:r>
-          </w:p>
-        </w:tc>
-        <w:tc>
-          <w:tcPr>
-            <w:tcW w:type="dxa" w:w="1440"/>
-          </w:tcPr>
-          <w:p>
-            <w:r>
-              <w:t>0.0278</w:t>
-            </w:r>
-          </w:p>
-        </w:tc>
-        <w:tc>
-          <w:tcPr>
-            <w:tcW w:type="dxa" w:w="1440"/>
-          </w:tcPr>
-          <w:p>
-            <w:r>
-              <w:t>0.0083</w:t>
-            </w:r>
-          </w:p>
-        </w:tc>
-        <w:tc>
-          <w:tcPr>
-            <w:tcW w:type="dxa" w:w="1440"/>
-          </w:tcPr>
-          <w:p>
-            <w:r>
-              <w:t>0.0493</w:t>
-            </w:r>
-          </w:p>
-        </w:tc>
-      </w:tr>
-      <w:tr>
-        <w:tc>
-          <w:tcPr>
-            <w:tcW w:type="dxa" w:w="1440"/>
-          </w:tcPr>
-          <w:p>
-            <w:r>
-              <w:t>25</w:t>
-            </w:r>
-          </w:p>
-        </w:tc>
-        <w:tc>
-          <w:tcPr>
-            <w:tcW w:type="dxa" w:w="1440"/>
-          </w:tcPr>
-          <w:p>
-            <w:r>
-              <w:t>hgb</w:t>
-            </w:r>
-          </w:p>
-        </w:tc>
-        <w:tc>
-          <w:tcPr>
-            <w:tcW w:type="dxa" w:w="1440"/>
-          </w:tcPr>
-          <w:p>
-            <w:r>
-              <w:t>disability</w:t>
-            </w:r>
-          </w:p>
-        </w:tc>
-        <w:tc>
-          <w:tcPr>
-            <w:tcW w:type="dxa" w:w="1440"/>
-          </w:tcPr>
-          <w:p>
-            <w:r>
-              <w:t>0.0205</w:t>
-            </w:r>
-          </w:p>
-        </w:tc>
-        <w:tc>
-          <w:tcPr>
-            <w:tcW w:type="dxa" w:w="1440"/>
-          </w:tcPr>
-          <w:p>
-            <w:r>
-              <w:t>-0.0108</w:t>
-            </w:r>
-          </w:p>
-        </w:tc>
-        <w:tc>
-          <w:tcPr>
-            <w:tcW w:type="dxa" w:w="1440"/>
-          </w:tcPr>
-          <w:p>
-            <w:r>
-              <w:t>0.0538</w:t>
-            </w:r>
-          </w:p>
-        </w:tc>
-      </w:tr>
-      <w:tr>
-        <w:tc>
-          <w:tcPr>
-            <w:tcW w:type="dxa" w:w="1440"/>
-          </w:tcPr>
-          <w:p>
-            <w:r>
-              <w:t>25</w:t>
-            </w:r>
-          </w:p>
-        </w:tc>
-        <w:tc>
-          <w:tcPr>
-            <w:tcW w:type="dxa" w:w="1440"/>
-          </w:tcPr>
-          <w:p>
-            <w:r>
-              <w:t>hgb</w:t>
-            </w:r>
-          </w:p>
-        </w:tc>
-        <w:tc>
-          <w:tcPr>
-            <w:tcW w:type="dxa" w:w="1440"/>
-          </w:tcPr>
-          <w:p>
-            <w:r>
-              <w:t>age</w:t>
-            </w:r>
-          </w:p>
-        </w:tc>
-        <w:tc>
-          <w:tcPr>
-            <w:tcW w:type="dxa" w:w="1440"/>
-          </w:tcPr>
-          <w:p>
-            <w:r>
-              <w:t>-0.0049</w:t>
-            </w:r>
-          </w:p>
-        </w:tc>
-        <w:tc>
-          <w:tcPr>
-            <w:tcW w:type="dxa" w:w="1440"/>
-          </w:tcPr>
-          <w:p>
-            <w:r>
-              <w:t>-0.1013</w:t>
-            </w:r>
-          </w:p>
-        </w:tc>
-        <w:tc>
-          <w:tcPr>
-            <w:tcW w:type="dxa" w:w="1440"/>
-          </w:tcPr>
-          <w:p>
-            <w:r>
-              <w:t>0.0592</w:t>
+            <w:tcW w:type="dxa" w:w="1234"/>
+          </w:tcPr>
+          <w:p>
+            <w:r>
+              <w:t>15.0000</w:t>
+            </w:r>
+          </w:p>
+        </w:tc>
+        <w:tc>
+          <w:tcPr>
+            <w:tcW w:type="dxa" w:w="1234"/>
+          </w:tcPr>
+          <w:p>
+            <w:r>
+              <w:t>11.6941</w:t>
+            </w:r>
+          </w:p>
+        </w:tc>
+        <w:tc>
+          <w:tcPr>
+            <w:tcW w:type="dxa" w:w="1234"/>
+          </w:tcPr>
+          <w:p>
+            <w:r>
+              <w:t>16.1860</w:t>
+            </w:r>
+          </w:p>
+        </w:tc>
+        <w:tc>
+          <w:tcPr>
+            <w:tcW w:type="dxa" w:w="1234"/>
+          </w:tcPr>
+          <w:p>
+            <w:r>
+              <w:t>-4.4919</w:t>
+            </w:r>
+          </w:p>
+        </w:tc>
+        <w:tc>
+          <w:tcPr>
+            <w:tcW w:type="dxa" w:w="1234"/>
+          </w:tcPr>
+          <w:p>
+            <w:r>
+              <w:t>-5.6445</w:t>
+            </w:r>
+          </w:p>
+        </w:tc>
+        <w:tc>
+          <w:tcPr>
+            <w:tcW w:type="dxa" w:w="1234"/>
+          </w:tcPr>
+          <w:p>
+            <w:r>
+              <w:t>-14.5475</w:t>
+            </w:r>
+          </w:p>
+        </w:tc>
+        <w:tc>
+          <w:tcPr>
+            <w:tcW w:type="dxa" w:w="1234"/>
+          </w:tcPr>
+          <w:p>
+            <w:r>
+              <w:t>1.3298</w:t>
             </w:r>
           </w:p>
         </w:tc>
@@ -7803,7 +5729,7 @@
               <a:graphicData uri="http://schemas.openxmlformats.org/drawingml/2006/picture">
                 <pic:pic>
                   <pic:nvPicPr>
-                    <pic:cNvPr id="0" name="fig_fairness_eo_gap.png"/>
+                    <pic:cNvPr id="0" name="fig_recourse_distance_by_group.png"/>
                     <pic:cNvPicPr/>
                   </pic:nvPicPr>
                   <pic:blipFill>
@@ -7832,7 +5758,97 @@
           <w:i/>
           <w:sz w:val="18"/>
         </w:rPr>
-        <w:t>Equal-opportunity gap by cutoff and attribute, gradient boosting.</w:t>
+        <w:t>Mean recourse distance by group (week 15).</w:t>
+      </w:r>
+    </w:p>
+    <w:p>
+      <w:r>
+        <w:drawing>
+          <wp:inline xmlns:a="http://schemas.openxmlformats.org/drawingml/2006/main" xmlns:pic="http://schemas.openxmlformats.org/drawingml/2006/picture">
+            <wp:extent cx="4846320" cy="3028950"/>
+            <wp:docPr id="10" name="Picture 10"/>
+            <wp:cNvGraphicFramePr>
+              <a:graphicFrameLocks noChangeAspect="1"/>
+            </wp:cNvGraphicFramePr>
+            <a:graphic>
+              <a:graphicData uri="http://schemas.openxmlformats.org/drawingml/2006/picture">
+                <pic:pic>
+                  <pic:nvPicPr>
+                    <pic:cNvPr id="0" name="fig_cf_success_by_group.png"/>
+                    <pic:cNvPicPr/>
+                  </pic:nvPicPr>
+                  <pic:blipFill>
+                    <a:blip r:embed="rId18"/>
+                    <a:stretch>
+                      <a:fillRect/>
+                    </a:stretch>
+                  </pic:blipFill>
+                  <pic:spPr>
+                    <a:xfrm>
+                      <a:off x="0" y="0"/>
+                      <a:ext cx="4846320" cy="3028950"/>
+                    </a:xfrm>
+                    <a:prstGeom prst="rect"/>
+                  </pic:spPr>
+                </pic:pic>
+              </a:graphicData>
+            </a:graphic>
+          </wp:inline>
+        </w:drawing>
+      </w:r>
+    </w:p>
+    <w:p>
+      <w:r>
+        <w:rPr>
+          <w:i/>
+          <w:sz w:val="18"/>
+        </w:rPr>
+        <w:t>Counterfactual availability by group.</w:t>
+      </w:r>
+    </w:p>
+    <w:p>
+      <w:r>
+        <w:drawing>
+          <wp:inline xmlns:a="http://schemas.openxmlformats.org/drawingml/2006/main" xmlns:pic="http://schemas.openxmlformats.org/drawingml/2006/picture">
+            <wp:extent cx="4846320" cy="3126658"/>
+            <wp:docPr id="11" name="Picture 11"/>
+            <wp:cNvGraphicFramePr>
+              <a:graphicFrameLocks noChangeAspect="1"/>
+            </wp:cNvGraphicFramePr>
+            <a:graphic>
+              <a:graphicData uri="http://schemas.openxmlformats.org/drawingml/2006/picture">
+                <pic:pic>
+                  <pic:nvPicPr>
+                    <pic:cNvPr id="0" name="fig_recourse_gap_raw_vs_adjusted.png"/>
+                    <pic:cNvPicPr/>
+                  </pic:nvPicPr>
+                  <pic:blipFill>
+                    <a:blip r:embed="rId19"/>
+                    <a:stretch>
+                      <a:fillRect/>
+                    </a:stretch>
+                  </pic:blipFill>
+                  <pic:spPr>
+                    <a:xfrm>
+                      <a:off x="0" y="0"/>
+                      <a:ext cx="4846320" cy="3126658"/>
+                    </a:xfrm>
+                    <a:prstGeom prst="rect"/>
+                  </pic:spPr>
+                </pic:pic>
+              </a:graphicData>
+            </a:graphic>
+          </wp:inline>
+        </w:drawing>
+      </w:r>
+    </w:p>
+    <w:p>
+      <w:r>
+        <w:rPr>
+          <w:i/>
+          <w:sz w:val="18"/>
+        </w:rPr>
+        <w:t>Recourse-burden gap: raw vs base-rate-adjusted.</w:t>
       </w:r>
     </w:p>
     <w:p>
@@ -7840,17 +5856,347 @@
         <w:pStyle w:val="Heading1"/>
       </w:pPr>
       <w:r>
-        <w:t>5. Trust-equity summary and next steps</w:t>
+        <w:t>6. Trust-equity summary (C6)</w:t>
       </w:r>
     </w:p>
     <w:p>
       <w:r>
-        <w:t>The trust-equity picture has two honest parts. Explanation faithfulness is not unequal across deprivation once base rate is controlled, which corrects an earlier apparent finding and stands as a methodological caution. The fairness audit, by contrast, surfaces a real and uncomfortable result: the same disadvantaged groups that are detected at higher true-positive rates are also over-flagged when not at risk, with the false-positive burden concentrated at the early cutoffs where the system is most useful.</w:t>
+        <w:t>Consolidated trust-equity view by protected group (week 15, gradient boosting): subgroup calibration error, true- and false-positive rates, recourse distance, and counterfactual availability.</w:t>
+      </w:r>
+    </w:p>
+    <w:tbl>
+      <w:tblPr>
+        <w:tblStyle w:val="LightGrid-Accent1"/>
+        <w:tblW w:type="auto" w:w="0"/>
+        <w:tblLook w:firstColumn="1" w:firstRow="1" w:lastColumn="0" w:lastRow="0" w:noHBand="0" w:noVBand="1" w:val="04A0"/>
+      </w:tblPr>
+      <w:tblGrid>
+        <w:gridCol w:w="1440"/>
+        <w:gridCol w:w="1440"/>
+        <w:gridCol w:w="1440"/>
+        <w:gridCol w:w="1440"/>
+        <w:gridCol w:w="1440"/>
+        <w:gridCol w:w="1440"/>
+      </w:tblGrid>
+      <w:tr>
+        <w:tc>
+          <w:tcPr>
+            <w:tcW w:type="dxa" w:w="1440"/>
+          </w:tcPr>
+          <w:p>
+            <w:r>
+              <w:t>group</w:t>
+            </w:r>
+          </w:p>
+        </w:tc>
+        <w:tc>
+          <w:tcPr>
+            <w:tcW w:type="dxa" w:w="1440"/>
+          </w:tcPr>
+          <w:p>
+            <w:r>
+              <w:t>ECE</w:t>
+            </w:r>
+          </w:p>
+        </w:tc>
+        <w:tc>
+          <w:tcPr>
+            <w:tcW w:type="dxa" w:w="1440"/>
+          </w:tcPr>
+          <w:p>
+            <w:r>
+              <w:t>TPR</w:t>
+            </w:r>
+          </w:p>
+        </w:tc>
+        <w:tc>
+          <w:tcPr>
+            <w:tcW w:type="dxa" w:w="1440"/>
+          </w:tcPr>
+          <w:p>
+            <w:r>
+              <w:t>FPR</w:t>
+            </w:r>
+          </w:p>
+        </w:tc>
+        <w:tc>
+          <w:tcPr>
+            <w:tcW w:type="dxa" w:w="1440"/>
+          </w:tcPr>
+          <w:p>
+            <w:r>
+              <w:t>recourse_distance</w:t>
+            </w:r>
+          </w:p>
+        </w:tc>
+        <w:tc>
+          <w:tcPr>
+            <w:tcW w:type="dxa" w:w="1440"/>
+          </w:tcPr>
+          <w:p>
+            <w:r>
+              <w:t>cf_success_rate</w:t>
+            </w:r>
+          </w:p>
+        </w:tc>
+      </w:tr>
+      <w:tr>
+        <w:tc>
+          <w:tcPr>
+            <w:tcW w:type="dxa" w:w="1440"/>
+          </w:tcPr>
+          <w:p>
+            <w:r>
+              <w:t>deprived</w:t>
+            </w:r>
+          </w:p>
+        </w:tc>
+        <w:tc>
+          <w:tcPr>
+            <w:tcW w:type="dxa" w:w="1440"/>
+          </w:tcPr>
+          <w:p>
+            <w:r>
+              <w:t>0.0178</w:t>
+            </w:r>
+          </w:p>
+        </w:tc>
+        <w:tc>
+          <w:tcPr>
+            <w:tcW w:type="dxa" w:w="1440"/>
+          </w:tcPr>
+          <w:p>
+            <w:r>
+              <w:t>0.8159</w:t>
+            </w:r>
+          </w:p>
+        </w:tc>
+        <w:tc>
+          <w:tcPr>
+            <w:tcW w:type="dxa" w:w="1440"/>
+          </w:tcPr>
+          <w:p>
+            <w:r>
+              <w:t>0.0912</w:t>
+            </w:r>
+          </w:p>
+        </w:tc>
+        <w:tc>
+          <w:tcPr>
+            <w:tcW w:type="dxa" w:w="1440"/>
+          </w:tcPr>
+          <w:p>
+            <w:r>
+              <w:t>11.6941</w:t>
+            </w:r>
+          </w:p>
+        </w:tc>
+        <w:tc>
+          <w:tcPr>
+            <w:tcW w:type="dxa" w:w="1440"/>
+          </w:tcPr>
+          <w:p>
+            <w:r>
+              <w:t>0.9018</w:t>
+            </w:r>
+          </w:p>
+        </w:tc>
+      </w:tr>
+      <w:tr>
+        <w:tc>
+          <w:tcPr>
+            <w:tcW w:type="dxa" w:w="1440"/>
+          </w:tcPr>
+          <w:p>
+            <w:r>
+              <w:t>affluent</w:t>
+            </w:r>
+          </w:p>
+        </w:tc>
+        <w:tc>
+          <w:tcPr>
+            <w:tcW w:type="dxa" w:w="1440"/>
+          </w:tcPr>
+          <w:p>
+            <w:r>
+              <w:t>0.0198</w:t>
+            </w:r>
+          </w:p>
+        </w:tc>
+        <w:tc>
+          <w:tcPr>
+            <w:tcW w:type="dxa" w:w="1440"/>
+          </w:tcPr>
+          <w:p>
+            <w:r>
+              <w:t>0.7808</w:t>
+            </w:r>
+          </w:p>
+        </w:tc>
+        <w:tc>
+          <w:tcPr>
+            <w:tcW w:type="dxa" w:w="1440"/>
+          </w:tcPr>
+          <w:p>
+            <w:r>
+              <w:t>0.0594</w:t>
+            </w:r>
+          </w:p>
+        </w:tc>
+        <w:tc>
+          <w:tcPr>
+            <w:tcW w:type="dxa" w:w="1440"/>
+          </w:tcPr>
+          <w:p>
+            <w:r>
+              <w:t>16.1860</w:t>
+            </w:r>
+          </w:p>
+        </w:tc>
+        <w:tc>
+          <w:tcPr>
+            <w:tcW w:type="dxa" w:w="1440"/>
+          </w:tcPr>
+          <w:p>
+            <w:r>
+              <w:t>0.9091</w:t>
+            </w:r>
+          </w:p>
+        </w:tc>
+      </w:tr>
+      <w:tr>
+        <w:tc>
+          <w:tcPr>
+            <w:tcW w:type="dxa" w:w="1440"/>
+          </w:tcPr>
+          <w:p>
+            <w:r>
+              <w:t>disabled</w:t>
+            </w:r>
+          </w:p>
+        </w:tc>
+        <w:tc>
+          <w:tcPr>
+            <w:tcW w:type="dxa" w:w="1440"/>
+          </w:tcPr>
+          <w:p>
+            <w:r>
+              <w:t>0.0395</w:t>
+            </w:r>
+          </w:p>
+        </w:tc>
+        <w:tc>
+          <w:tcPr>
+            <w:tcW w:type="dxa" w:w="1440"/>
+          </w:tcPr>
+          <w:p>
+            <w:r>
+              <w:t>0.8337</w:t>
+            </w:r>
+          </w:p>
+        </w:tc>
+        <w:tc>
+          <w:tcPr>
+            <w:tcW w:type="dxa" w:w="1440"/>
+          </w:tcPr>
+          <w:p>
+            <w:r>
+              <w:t>0.1270</w:t>
+            </w:r>
+          </w:p>
+        </w:tc>
+        <w:tc>
+          <w:tcPr>
+            <w:tcW w:type="dxa" w:w="1440"/>
+          </w:tcPr>
+          <w:p>
+            <w:r>
+              <w:t>15.3607</w:t>
+            </w:r>
+          </w:p>
+        </w:tc>
+        <w:tc>
+          <w:tcPr>
+            <w:tcW w:type="dxa" w:w="1440"/>
+          </w:tcPr>
+          <w:p>
+            <w:r>
+              <w:t>0.9273</w:t>
+            </w:r>
+          </w:p>
+        </w:tc>
+      </w:tr>
+      <w:tr>
+        <w:tc>
+          <w:tcPr>
+            <w:tcW w:type="dxa" w:w="1440"/>
+          </w:tcPr>
+          <w:p>
+            <w:r>
+              <w:t>not_disabled</w:t>
+            </w:r>
+          </w:p>
+        </w:tc>
+        <w:tc>
+          <w:tcPr>
+            <w:tcW w:type="dxa" w:w="1440"/>
+          </w:tcPr>
+          <w:p>
+            <w:r>
+              <w:t>0.0088</w:t>
+            </w:r>
+          </w:p>
+        </w:tc>
+        <w:tc>
+          <w:tcPr>
+            <w:tcW w:type="dxa" w:w="1440"/>
+          </w:tcPr>
+          <w:p>
+            <w:r>
+              <w:t>0.7835</w:t>
+            </w:r>
+          </w:p>
+        </w:tc>
+        <w:tc>
+          <w:tcPr>
+            <w:tcW w:type="dxa" w:w="1440"/>
+          </w:tcPr>
+          <w:p>
+            <w:r>
+              <w:t>0.0680</w:t>
+            </w:r>
+          </w:p>
+        </w:tc>
+        <w:tc>
+          <w:tcPr>
+            <w:tcW w:type="dxa" w:w="1440"/>
+          </w:tcPr>
+          <w:p>
+            <w:r>
+              <w:t>11.6926</w:t>
+            </w:r>
+          </w:p>
+        </w:tc>
+        <w:tc>
+          <w:tcPr>
+            <w:tcW w:type="dxa" w:w="1440"/>
+          </w:tcPr>
+          <w:p>
+            <w:r>
+              <w:t>0.9139</w:t>
+            </w:r>
+          </w:p>
+        </w:tc>
+      </w:tr>
+    </w:tbl>
+    <w:p>
+      <w:r>
+        <w:t>Across four trust dimensions the layer is equitable on three and shows one localised harm. Calibration holds within groups (subgroup ECE 0.0178 deprived versus 0.0198 affluent, and 0.0395 disabled versus 0.0088 non-disabled). Explanation faithfulness shows no reliable subgroup difference after base-rate adjustment, and recourse burden likewise shows no reliable difference, with counterfactuals found about equally often for every group. The single exception is false-positive burden: not-at-risk deprived students are flagged at 0.0912 against 0.0594 for affluent, and not-at-risk disabled students at 0.1270 against 0.0680 for non-disabled. The inequity in this system is concentrated at the decision threshold, not in explanation quality, calibration, or the recourse pathway. The base-rate adjustment is what allows the three nulls to be asserted rather than mistaking base-rate artifacts for harms.</w:t>
       </w:r>
     </w:p>
     <w:p>
       <w:r>
-        <w:t>Next: Notebook 05 computes mutability-constrained counterfactuals and the recourse-burden disparity, a separate equity axis, then assembles the trust-equity table bringing calibration, faithfulness, fairness, and recourse together by protected group. The Withdrawn-excluded robustness variant remains to run.</w:t>
+        <w:t>Remaining work: the Withdrawn-excluded robustness variant, and threshold or post-processing mitigation targeted at the false-positive burden, which is the one dimension where the trust layer is not equitable.</w:t>
       </w:r>
     </w:p>
     <w:sectPr>

</xml_diff>